<commit_message>
Publish complete Week 6 Substack Word article
</commit_message>
<xml_diff>
--- a/data/projections/Roster_Report_Week6_Substack_Ready.docx
+++ b/data/projections/Roster_Report_Week6_Substack_Ready.docx
@@ -139,59 +139,59 @@
                 <w:color w:val="657589"/>
                 <w:sz w:val="16"/>
               </w:rPr>
-              <w:t>32.5 pass att · 293 pass yds · 2.62 pass TD · 0.87 INT · 6.6 rush att · 33 rush yds · 0.27 rush TD</w:t>
-            </w:r>
-          </w:p>
-        </w:tc>
-        <w:tc>
-          <w:tcPr>
-            <w:tcW w:type="dxa" w:w="893"/>
-            <w:vAlign w:val="center"/>
-          </w:tcPr>
-          <w:p>
-            <w:pPr>
-              <w:jc w:val="right"/>
-            </w:pPr>
-            <w:r>
-              <w:rPr>
-                <w:sz w:val="18"/>
-              </w:rPr>
-              <w:t>25.33</w:t>
-            </w:r>
-          </w:p>
-        </w:tc>
-        <w:tc>
-          <w:tcPr>
-            <w:tcW w:type="dxa" w:w="893"/>
-            <w:vAlign w:val="center"/>
-          </w:tcPr>
-          <w:p>
-            <w:pPr>
-              <w:jc w:val="right"/>
-            </w:pPr>
-            <w:r>
-              <w:rPr>
-                <w:sz w:val="18"/>
-              </w:rPr>
-              <w:t>25.33</w:t>
-            </w:r>
-          </w:p>
-        </w:tc>
-        <w:tc>
-          <w:tcPr>
-            <w:tcW w:type="dxa" w:w="893"/>
-            <w:vAlign w:val="center"/>
-          </w:tcPr>
-          <w:p>
-            <w:pPr>
-              <w:jc w:val="right"/>
-            </w:pPr>
-            <w:r>
-              <w:rPr>
-                <w:b/>
-                <w:sz w:val="18"/>
-              </w:rPr>
-              <w:t>25.33</w:t>
+              <w:t>32.5 pass att · 271 pass yds · 2.62 pass TD · 0.87 INT · 6.6 rush att · 33 rush yds · 0.27 rush TD</w:t>
+            </w:r>
+          </w:p>
+        </w:tc>
+        <w:tc>
+          <w:tcPr>
+            <w:tcW w:type="dxa" w:w="893"/>
+            <w:vAlign w:val="center"/>
+          </w:tcPr>
+          <w:p>
+            <w:pPr>
+              <w:jc w:val="right"/>
+            </w:pPr>
+            <w:r>
+              <w:rPr>
+                <w:sz w:val="18"/>
+              </w:rPr>
+              <w:t>24.48</w:t>
+            </w:r>
+          </w:p>
+        </w:tc>
+        <w:tc>
+          <w:tcPr>
+            <w:tcW w:type="dxa" w:w="893"/>
+            <w:vAlign w:val="center"/>
+          </w:tcPr>
+          <w:p>
+            <w:pPr>
+              <w:jc w:val="right"/>
+            </w:pPr>
+            <w:r>
+              <w:rPr>
+                <w:sz w:val="18"/>
+              </w:rPr>
+              <w:t>24.48</w:t>
+            </w:r>
+          </w:p>
+        </w:tc>
+        <w:tc>
+          <w:tcPr>
+            <w:tcW w:type="dxa" w:w="893"/>
+            <w:vAlign w:val="center"/>
+          </w:tcPr>
+          <w:p>
+            <w:pPr>
+              <w:jc w:val="right"/>
+            </w:pPr>
+            <w:r>
+              <w:rPr>
+                <w:b/>
+                <w:sz w:val="18"/>
+              </w:rPr>
+              <w:t>24.48</w:t>
             </w:r>
           </w:p>
         </w:tc>
@@ -4444,59 +4444,59 @@
                 <w:color w:val="657589"/>
                 <w:sz w:val="16"/>
               </w:rPr>
-              <w:t>11.1 rush att · 47 rush yds · 0.37 rush TD · 0.5 tgt · 0.5 rec · 3 rec yds · 0.00 rec TD</w:t>
-            </w:r>
-          </w:p>
-        </w:tc>
-        <w:tc>
-          <w:tcPr>
-            <w:tcW w:type="dxa" w:w="893"/>
-            <w:vAlign w:val="center"/>
-          </w:tcPr>
-          <w:p>
-            <w:pPr>
-              <w:jc w:val="right"/>
-            </w:pPr>
-            <w:r>
-              <w:rPr>
-                <w:sz w:val="18"/>
-              </w:rPr>
-              <w:t>7.28</w:t>
-            </w:r>
-          </w:p>
-        </w:tc>
-        <w:tc>
-          <w:tcPr>
-            <w:tcW w:type="dxa" w:w="893"/>
-            <w:vAlign w:val="center"/>
-          </w:tcPr>
-          <w:p>
-            <w:pPr>
-              <w:jc w:val="right"/>
-            </w:pPr>
-            <w:r>
-              <w:rPr>
-                <w:sz w:val="18"/>
-              </w:rPr>
-              <w:t>7.50</w:t>
-            </w:r>
-          </w:p>
-        </w:tc>
-        <w:tc>
-          <w:tcPr>
-            <w:tcW w:type="dxa" w:w="893"/>
-            <w:vAlign w:val="center"/>
-          </w:tcPr>
-          <w:p>
-            <w:pPr>
-              <w:jc w:val="right"/>
-            </w:pPr>
-            <w:r>
-              <w:rPr>
-                <w:b/>
-                <w:sz w:val="18"/>
-              </w:rPr>
-              <w:t>7.72</w:t>
+              <w:t>11.1 rush att · 47 rush yds · 0.37 rush TD · 0.7 tgt · 0.5 rec · 4 rec yds · 0.00 rec TD</w:t>
+            </w:r>
+          </w:p>
+        </w:tc>
+        <w:tc>
+          <w:tcPr>
+            <w:tcW w:type="dxa" w:w="893"/>
+            <w:vAlign w:val="center"/>
+          </w:tcPr>
+          <w:p>
+            <w:pPr>
+              <w:jc w:val="right"/>
+            </w:pPr>
+            <w:r>
+              <w:rPr>
+                <w:sz w:val="18"/>
+              </w:rPr>
+              <w:t>7.34</w:t>
+            </w:r>
+          </w:p>
+        </w:tc>
+        <w:tc>
+          <w:tcPr>
+            <w:tcW w:type="dxa" w:w="893"/>
+            <w:vAlign w:val="center"/>
+          </w:tcPr>
+          <w:p>
+            <w:pPr>
+              <w:jc w:val="right"/>
+            </w:pPr>
+            <w:r>
+              <w:rPr>
+                <w:sz w:val="18"/>
+              </w:rPr>
+              <w:t>7.61</w:t>
+            </w:r>
+          </w:p>
+        </w:tc>
+        <w:tc>
+          <w:tcPr>
+            <w:tcW w:type="dxa" w:w="893"/>
+            <w:vAlign w:val="center"/>
+          </w:tcPr>
+          <w:p>
+            <w:pPr>
+              <w:jc w:val="right"/>
+            </w:pPr>
+            <w:r>
+              <w:rPr>
+                <w:b/>
+                <w:sz w:val="18"/>
+              </w:rPr>
+              <w:t>7.87</w:t>
             </w:r>
           </w:p>
         </w:tc>
@@ -4891,44 +4891,44 @@
               <w:rPr>
                 <w:sz w:val="18"/>
               </w:rPr>
-              <w:t>4.86</w:t>
-            </w:r>
-          </w:p>
-        </w:tc>
-        <w:tc>
-          <w:tcPr>
-            <w:tcW w:type="dxa" w:w="893"/>
-            <w:vAlign w:val="center"/>
-            <w:shd w:fill="F2F5F8"/>
-          </w:tcPr>
-          <w:p>
-            <w:pPr>
-              <w:jc w:val="right"/>
-            </w:pPr>
-            <w:r>
-              <w:rPr>
-                <w:sz w:val="18"/>
-              </w:rPr>
-              <w:t>4.90</w:t>
-            </w:r>
-          </w:p>
-        </w:tc>
-        <w:tc>
-          <w:tcPr>
-            <w:tcW w:type="dxa" w:w="893"/>
-            <w:vAlign w:val="center"/>
-            <w:shd w:fill="F2F5F8"/>
-          </w:tcPr>
-          <w:p>
-            <w:pPr>
-              <w:jc w:val="right"/>
-            </w:pPr>
-            <w:r>
-              <w:rPr>
-                <w:b/>
-                <w:sz w:val="18"/>
-              </w:rPr>
-              <w:t>4.94</w:t>
+              <w:t>4.88</w:t>
+            </w:r>
+          </w:p>
+        </w:tc>
+        <w:tc>
+          <w:tcPr>
+            <w:tcW w:type="dxa" w:w="893"/>
+            <w:vAlign w:val="center"/>
+            <w:shd w:fill="F2F5F8"/>
+          </w:tcPr>
+          <w:p>
+            <w:pPr>
+              <w:jc w:val="right"/>
+            </w:pPr>
+            <w:r>
+              <w:rPr>
+                <w:sz w:val="18"/>
+              </w:rPr>
+              <w:t>4.93</w:t>
+            </w:r>
+          </w:p>
+        </w:tc>
+        <w:tc>
+          <w:tcPr>
+            <w:tcW w:type="dxa" w:w="893"/>
+            <w:vAlign w:val="center"/>
+            <w:shd w:fill="F2F5F8"/>
+          </w:tcPr>
+          <w:p>
+            <w:pPr>
+              <w:jc w:val="right"/>
+            </w:pPr>
+            <w:r>
+              <w:rPr>
+                <w:b/>
+                <w:sz w:val="18"/>
+              </w:rPr>
+              <w:t>4.98</w:t>
             </w:r>
           </w:p>
         </w:tc>
@@ -5561,62 +5561,62 @@
                 <w:color w:val="657589"/>
                 <w:sz w:val="16"/>
               </w:rPr>
-              <w:t>4.0 rush att · 26 rush yds · 0.08 rush TD · 0.1 tgt · 0.0 rec · 0 rec yds · 0.00 rec TD</w:t>
-            </w:r>
-          </w:p>
-        </w:tc>
-        <w:tc>
-          <w:tcPr>
-            <w:tcW w:type="dxa" w:w="893"/>
-            <w:vAlign w:val="center"/>
-            <w:shd w:fill="F2F5F8"/>
-          </w:tcPr>
-          <w:p>
-            <w:pPr>
-              <w:jc w:val="right"/>
-            </w:pPr>
-            <w:r>
-              <w:rPr>
-                <w:sz w:val="18"/>
-              </w:rPr>
-              <w:t>3.10</w:t>
-            </w:r>
-          </w:p>
-        </w:tc>
-        <w:tc>
-          <w:tcPr>
-            <w:tcW w:type="dxa" w:w="893"/>
-            <w:vAlign w:val="center"/>
-            <w:shd w:fill="F2F5F8"/>
-          </w:tcPr>
-          <w:p>
-            <w:pPr>
-              <w:jc w:val="right"/>
-            </w:pPr>
-            <w:r>
-              <w:rPr>
-                <w:sz w:val="18"/>
-              </w:rPr>
-              <w:t>3.12</w:t>
-            </w:r>
-          </w:p>
-        </w:tc>
-        <w:tc>
-          <w:tcPr>
-            <w:tcW w:type="dxa" w:w="893"/>
-            <w:vAlign w:val="center"/>
-            <w:shd w:fill="F2F5F8"/>
-          </w:tcPr>
-          <w:p>
-            <w:pPr>
-              <w:jc w:val="right"/>
-            </w:pPr>
-            <w:r>
-              <w:rPr>
-                <w:b/>
-                <w:sz w:val="18"/>
-              </w:rPr>
-              <w:t>3.14</w:t>
+              <w:t>4.0 rush att · 26 rush yds · 0.08 rush TD · 0.1 tgt · 0.1 rec · 0 rec yds · 0.00 rec TD</w:t>
+            </w:r>
+          </w:p>
+        </w:tc>
+        <w:tc>
+          <w:tcPr>
+            <w:tcW w:type="dxa" w:w="893"/>
+            <w:vAlign w:val="center"/>
+            <w:shd w:fill="F2F5F8"/>
+          </w:tcPr>
+          <w:p>
+            <w:pPr>
+              <w:jc w:val="right"/>
+            </w:pPr>
+            <w:r>
+              <w:rPr>
+                <w:sz w:val="18"/>
+              </w:rPr>
+              <w:t>3.11</w:t>
+            </w:r>
+          </w:p>
+        </w:tc>
+        <w:tc>
+          <w:tcPr>
+            <w:tcW w:type="dxa" w:w="893"/>
+            <w:vAlign w:val="center"/>
+            <w:shd w:fill="F2F5F8"/>
+          </w:tcPr>
+          <w:p>
+            <w:pPr>
+              <w:jc w:val="right"/>
+            </w:pPr>
+            <w:r>
+              <w:rPr>
+                <w:sz w:val="18"/>
+              </w:rPr>
+              <w:t>3.13</w:t>
+            </w:r>
+          </w:p>
+        </w:tc>
+        <w:tc>
+          <w:tcPr>
+            <w:tcW w:type="dxa" w:w="893"/>
+            <w:vAlign w:val="center"/>
+            <w:shd w:fill="F2F5F8"/>
+          </w:tcPr>
+          <w:p>
+            <w:pPr>
+              <w:jc w:val="right"/>
+            </w:pPr>
+            <w:r>
+              <w:rPr>
+                <w:b/>
+                <w:sz w:val="18"/>
+              </w:rPr>
+              <w:t>3.16</w:t>
             </w:r>
           </w:p>
         </w:tc>
@@ -7196,59 +7196,59 @@
                 <w:color w:val="657589"/>
                 <w:sz w:val="16"/>
               </w:rPr>
-              <w:t>0.0 rush att · 0 rush yds · 0.00 rush TD · 0.3 tgt · 0.3 rec · 1 rec yds · 0.00 rec TD</w:t>
-            </w:r>
-          </w:p>
-        </w:tc>
-        <w:tc>
-          <w:tcPr>
-            <w:tcW w:type="dxa" w:w="893"/>
-            <w:vAlign w:val="center"/>
-          </w:tcPr>
-          <w:p>
-            <w:pPr>
-              <w:jc w:val="right"/>
-            </w:pPr>
-            <w:r>
-              <w:rPr>
-                <w:sz w:val="18"/>
-              </w:rPr>
-              <w:t>0.14</w:t>
-            </w:r>
-          </w:p>
-        </w:tc>
-        <w:tc>
-          <w:tcPr>
-            <w:tcW w:type="dxa" w:w="893"/>
-            <w:vAlign w:val="center"/>
-          </w:tcPr>
-          <w:p>
-            <w:pPr>
-              <w:jc w:val="right"/>
-            </w:pPr>
-            <w:r>
-              <w:rPr>
-                <w:sz w:val="18"/>
-              </w:rPr>
-              <w:t>0.28</w:t>
-            </w:r>
-          </w:p>
-        </w:tc>
-        <w:tc>
-          <w:tcPr>
-            <w:tcW w:type="dxa" w:w="893"/>
-            <w:vAlign w:val="center"/>
-          </w:tcPr>
-          <w:p>
-            <w:pPr>
-              <w:jc w:val="right"/>
-            </w:pPr>
-            <w:r>
-              <w:rPr>
-                <w:b/>
-                <w:sz w:val="18"/>
-              </w:rPr>
-              <w:t>0.41</w:t>
+              <w:t>0.0 rush att · 0 rush yds · 0.00 rush TD · 0.3 tgt · 0.3 rec · 2 rec yds · 0.00 rec TD</w:t>
+            </w:r>
+          </w:p>
+        </w:tc>
+        <w:tc>
+          <w:tcPr>
+            <w:tcW w:type="dxa" w:w="893"/>
+            <w:vAlign w:val="center"/>
+          </w:tcPr>
+          <w:p>
+            <w:pPr>
+              <w:jc w:val="right"/>
+            </w:pPr>
+            <w:r>
+              <w:rPr>
+                <w:sz w:val="18"/>
+              </w:rPr>
+              <w:t>0.17</w:t>
+            </w:r>
+          </w:p>
+        </w:tc>
+        <w:tc>
+          <w:tcPr>
+            <w:tcW w:type="dxa" w:w="893"/>
+            <w:vAlign w:val="center"/>
+          </w:tcPr>
+          <w:p>
+            <w:pPr>
+              <w:jc w:val="right"/>
+            </w:pPr>
+            <w:r>
+              <w:rPr>
+                <w:sz w:val="18"/>
+              </w:rPr>
+              <w:t>0.33</w:t>
+            </w:r>
+          </w:p>
+        </w:tc>
+        <w:tc>
+          <w:tcPr>
+            <w:tcW w:type="dxa" w:w="893"/>
+            <w:vAlign w:val="center"/>
+          </w:tcPr>
+          <w:p>
+            <w:pPr>
+              <w:jc w:val="right"/>
+            </w:pPr>
+            <w:r>
+              <w:rPr>
+                <w:b/>
+                <w:sz w:val="18"/>
+              </w:rPr>
+              <w:t>0.49</w:t>
             </w:r>
           </w:p>
         </w:tc>
@@ -9510,7 +9510,7 @@
                 <w:b/>
                 <w:sz w:val="20"/>
               </w:rPr>
-              <w:t>Devaughn Vele</w:t>
+              <w:t>DeMario Douglas</w:t>
             </w:r>
           </w:p>
           <w:p>
@@ -9522,62 +9522,62 @@
                 <w:color w:val="657589"/>
                 <w:sz w:val="16"/>
               </w:rPr>
-              <w:t>0.1 rush att · 0 rush yds · 0.00 rush TD · 7.0 tgt · 4.7 rec · 41 rec yds · 0.34 rec TD</w:t>
-            </w:r>
-          </w:p>
-        </w:tc>
-        <w:tc>
-          <w:tcPr>
-            <w:tcW w:type="dxa" w:w="893"/>
-            <w:vAlign w:val="center"/>
-            <w:shd w:fill="F2F5F8"/>
-          </w:tcPr>
-          <w:p>
-            <w:pPr>
-              <w:jc w:val="right"/>
-            </w:pPr>
-            <w:r>
-              <w:rPr>
-                <w:sz w:val="18"/>
-              </w:rPr>
-              <w:t>6.16</w:t>
-            </w:r>
-          </w:p>
-        </w:tc>
-        <w:tc>
-          <w:tcPr>
-            <w:tcW w:type="dxa" w:w="893"/>
-            <w:vAlign w:val="center"/>
-            <w:shd w:fill="F2F5F8"/>
-          </w:tcPr>
-          <w:p>
-            <w:pPr>
-              <w:jc w:val="right"/>
-            </w:pPr>
-            <w:r>
-              <w:rPr>
-                <w:sz w:val="18"/>
-              </w:rPr>
-              <w:t>8.50</w:t>
-            </w:r>
-          </w:p>
-        </w:tc>
-        <w:tc>
-          <w:tcPr>
-            <w:tcW w:type="dxa" w:w="893"/>
-            <w:vAlign w:val="center"/>
-            <w:shd w:fill="F2F5F8"/>
-          </w:tcPr>
-          <w:p>
-            <w:pPr>
-              <w:jc w:val="right"/>
-            </w:pPr>
-            <w:r>
-              <w:rPr>
-                <w:b/>
-                <w:sz w:val="18"/>
-              </w:rPr>
-              <w:t>10.84</w:t>
+              <w:t>0.1 rush att · 0 rush yds · 0.00 rush TD · 5.1 tgt · 3.4 rec · 46 rec yds · 0.76 rec TD</w:t>
+            </w:r>
+          </w:p>
+        </w:tc>
+        <w:tc>
+          <w:tcPr>
+            <w:tcW w:type="dxa" w:w="893"/>
+            <w:vAlign w:val="center"/>
+            <w:shd w:fill="F2F5F8"/>
+          </w:tcPr>
+          <w:p>
+            <w:pPr>
+              <w:jc w:val="right"/>
+            </w:pPr>
+            <w:r>
+              <w:rPr>
+                <w:sz w:val="18"/>
+              </w:rPr>
+              <w:t>9.23</w:t>
+            </w:r>
+          </w:p>
+        </w:tc>
+        <w:tc>
+          <w:tcPr>
+            <w:tcW w:type="dxa" w:w="893"/>
+            <w:vAlign w:val="center"/>
+            <w:shd w:fill="F2F5F8"/>
+          </w:tcPr>
+          <w:p>
+            <w:pPr>
+              <w:jc w:val="right"/>
+            </w:pPr>
+            <w:r>
+              <w:rPr>
+                <w:sz w:val="18"/>
+              </w:rPr>
+              <w:t>10.91</w:t>
+            </w:r>
+          </w:p>
+        </w:tc>
+        <w:tc>
+          <w:tcPr>
+            <w:tcW w:type="dxa" w:w="893"/>
+            <w:vAlign w:val="center"/>
+            <w:shd w:fill="F2F5F8"/>
+          </w:tcPr>
+          <w:p>
+            <w:pPr>
+              <w:jc w:val="right"/>
+            </w:pPr>
+            <w:r>
+              <w:rPr>
+                <w:b/>
+                <w:sz w:val="18"/>
+              </w:rPr>
+              <w:t>12.60</w:t>
             </w:r>
           </w:p>
         </w:tc>
@@ -9597,7 +9597,7 @@
                 <w:b/>
                 <w:sz w:val="20"/>
               </w:rPr>
-              <w:t>DeMario Douglas</w:t>
+              <w:t>Romeo Doubs</w:t>
             </w:r>
           </w:p>
           <w:p>
@@ -9609,59 +9609,59 @@
                 <w:color w:val="657589"/>
                 <w:sz w:val="16"/>
               </w:rPr>
-              <w:t>0.1 rush att · 0 rush yds · 0.00 rush TD · 4.3 tgt · 2.8 rec · 39 rec yds · 0.64 rec TD</w:t>
-            </w:r>
-          </w:p>
-        </w:tc>
-        <w:tc>
-          <w:tcPr>
-            <w:tcW w:type="dxa" w:w="893"/>
-            <w:vAlign w:val="center"/>
-          </w:tcPr>
-          <w:p>
-            <w:pPr>
-              <w:jc w:val="right"/>
-            </w:pPr>
-            <w:r>
-              <w:rPr>
-                <w:sz w:val="18"/>
-              </w:rPr>
-              <w:t>7.76</w:t>
-            </w:r>
-          </w:p>
-        </w:tc>
-        <w:tc>
-          <w:tcPr>
-            <w:tcW w:type="dxa" w:w="893"/>
-            <w:vAlign w:val="center"/>
-          </w:tcPr>
-          <w:p>
-            <w:pPr>
-              <w:jc w:val="right"/>
-            </w:pPr>
-            <w:r>
-              <w:rPr>
-                <w:sz w:val="18"/>
-              </w:rPr>
-              <w:t>9.18</w:t>
-            </w:r>
-          </w:p>
-        </w:tc>
-        <w:tc>
-          <w:tcPr>
-            <w:tcW w:type="dxa" w:w="893"/>
-            <w:vAlign w:val="center"/>
-          </w:tcPr>
-          <w:p>
-            <w:pPr>
-              <w:jc w:val="right"/>
-            </w:pPr>
-            <w:r>
-              <w:rPr>
-                <w:b/>
-                <w:sz w:val="18"/>
-              </w:rPr>
-              <w:t>10.60</w:t>
+              <w:t>0.1 rush att · 0 rush yds · 0.00 rush TD · 5.7 tgt · 3.1 rec · 43 rec yds · 0.60 rec TD</w:t>
+            </w:r>
+          </w:p>
+        </w:tc>
+        <w:tc>
+          <w:tcPr>
+            <w:tcW w:type="dxa" w:w="893"/>
+            <w:vAlign w:val="center"/>
+          </w:tcPr>
+          <w:p>
+            <w:pPr>
+              <w:jc w:val="right"/>
+            </w:pPr>
+            <w:r>
+              <w:rPr>
+                <w:sz w:val="18"/>
+              </w:rPr>
+              <w:t>7.90</w:t>
+            </w:r>
+          </w:p>
+        </w:tc>
+        <w:tc>
+          <w:tcPr>
+            <w:tcW w:type="dxa" w:w="893"/>
+            <w:vAlign w:val="center"/>
+          </w:tcPr>
+          <w:p>
+            <w:pPr>
+              <w:jc w:val="right"/>
+            </w:pPr>
+            <w:r>
+              <w:rPr>
+                <w:sz w:val="18"/>
+              </w:rPr>
+              <w:t>9.46</w:t>
+            </w:r>
+          </w:p>
+        </w:tc>
+        <w:tc>
+          <w:tcPr>
+            <w:tcW w:type="dxa" w:w="893"/>
+            <w:vAlign w:val="center"/>
+          </w:tcPr>
+          <w:p>
+            <w:pPr>
+              <w:jc w:val="right"/>
+            </w:pPr>
+            <w:r>
+              <w:rPr>
+                <w:b/>
+                <w:sz w:val="18"/>
+              </w:rPr>
+              <w:t>11.01</w:t>
             </w:r>
           </w:p>
         </w:tc>
@@ -9682,7 +9682,7 @@
                 <w:b/>
                 <w:sz w:val="20"/>
               </w:rPr>
-              <w:t>Wan'Dale Robinson</w:t>
+              <w:t>Devaughn Vele</w:t>
             </w:r>
           </w:p>
           <w:p>
@@ -9694,62 +9694,62 @@
                 <w:color w:val="657589"/>
                 <w:sz w:val="16"/>
               </w:rPr>
-              <w:t>0.2 rush att · 0 rush yds · 0.00 rush TD · 6.0 tgt · 4.6 rec · 38 rec yds · 0.36 rec TD</w:t>
-            </w:r>
-          </w:p>
-        </w:tc>
-        <w:tc>
-          <w:tcPr>
-            <w:tcW w:type="dxa" w:w="893"/>
-            <w:vAlign w:val="center"/>
-            <w:shd w:fill="F2F5F8"/>
-          </w:tcPr>
-          <w:p>
-            <w:pPr>
-              <w:jc w:val="right"/>
-            </w:pPr>
-            <w:r>
-              <w:rPr>
-                <w:sz w:val="18"/>
-              </w:rPr>
-              <w:t>5.95</w:t>
-            </w:r>
-          </w:p>
-        </w:tc>
-        <w:tc>
-          <w:tcPr>
-            <w:tcW w:type="dxa" w:w="893"/>
-            <w:vAlign w:val="center"/>
-            <w:shd w:fill="F2F5F8"/>
-          </w:tcPr>
-          <w:p>
-            <w:pPr>
-              <w:jc w:val="right"/>
-            </w:pPr>
-            <w:r>
-              <w:rPr>
-                <w:sz w:val="18"/>
-              </w:rPr>
-              <w:t>8.25</w:t>
-            </w:r>
-          </w:p>
-        </w:tc>
-        <w:tc>
-          <w:tcPr>
-            <w:tcW w:type="dxa" w:w="893"/>
-            <w:vAlign w:val="center"/>
-            <w:shd w:fill="F2F5F8"/>
-          </w:tcPr>
-          <w:p>
-            <w:pPr>
-              <w:jc w:val="right"/>
-            </w:pPr>
-            <w:r>
-              <w:rPr>
-                <w:b/>
-                <w:sz w:val="18"/>
-              </w:rPr>
-              <w:t>10.54</w:t>
+              <w:t>0.1 rush att · 0 rush yds · 0.00 rush TD · 7.0 tgt · 4.7 rec · 41 rec yds · 0.34 rec TD</w:t>
+            </w:r>
+          </w:p>
+        </w:tc>
+        <w:tc>
+          <w:tcPr>
+            <w:tcW w:type="dxa" w:w="893"/>
+            <w:vAlign w:val="center"/>
+            <w:shd w:fill="F2F5F8"/>
+          </w:tcPr>
+          <w:p>
+            <w:pPr>
+              <w:jc w:val="right"/>
+            </w:pPr>
+            <w:r>
+              <w:rPr>
+                <w:sz w:val="18"/>
+              </w:rPr>
+              <w:t>6.16</w:t>
+            </w:r>
+          </w:p>
+        </w:tc>
+        <w:tc>
+          <w:tcPr>
+            <w:tcW w:type="dxa" w:w="893"/>
+            <w:vAlign w:val="center"/>
+            <w:shd w:fill="F2F5F8"/>
+          </w:tcPr>
+          <w:p>
+            <w:pPr>
+              <w:jc w:val="right"/>
+            </w:pPr>
+            <w:r>
+              <w:rPr>
+                <w:sz w:val="18"/>
+              </w:rPr>
+              <w:t>8.50</w:t>
+            </w:r>
+          </w:p>
+        </w:tc>
+        <w:tc>
+          <w:tcPr>
+            <w:tcW w:type="dxa" w:w="893"/>
+            <w:vAlign w:val="center"/>
+            <w:shd w:fill="F2F5F8"/>
+          </w:tcPr>
+          <w:p>
+            <w:pPr>
+              <w:jc w:val="right"/>
+            </w:pPr>
+            <w:r>
+              <w:rPr>
+                <w:b/>
+                <w:sz w:val="18"/>
+              </w:rPr>
+              <w:t>10.84</w:t>
             </w:r>
           </w:p>
         </w:tc>
@@ -9769,7 +9769,7 @@
                 <w:b/>
                 <w:sz w:val="20"/>
               </w:rPr>
-              <w:t>Carnell Tate</w:t>
+              <w:t>Wan'Dale Robinson</w:t>
             </w:r>
           </w:p>
           <w:p>
@@ -9781,59 +9781,59 @@
                 <w:color w:val="657589"/>
                 <w:sz w:val="16"/>
               </w:rPr>
-              <w:t>0.1 rush att · 0 rush yds · 0.00 rush TD · 8.1 tgt · 4.5 rec · 57 rec yds · 0.04 rec TD</w:t>
-            </w:r>
-          </w:p>
-        </w:tc>
-        <w:tc>
-          <w:tcPr>
-            <w:tcW w:type="dxa" w:w="893"/>
-            <w:vAlign w:val="center"/>
-          </w:tcPr>
-          <w:p>
-            <w:pPr>
-              <w:jc w:val="right"/>
-            </w:pPr>
-            <w:r>
-              <w:rPr>
-                <w:sz w:val="18"/>
-              </w:rPr>
-              <w:t>6.00</w:t>
-            </w:r>
-          </w:p>
-        </w:tc>
-        <w:tc>
-          <w:tcPr>
-            <w:tcW w:type="dxa" w:w="893"/>
-            <w:vAlign w:val="center"/>
-          </w:tcPr>
-          <w:p>
-            <w:pPr>
-              <w:jc w:val="right"/>
-            </w:pPr>
-            <w:r>
-              <w:rPr>
-                <w:sz w:val="18"/>
-              </w:rPr>
-              <w:t>8.24</w:t>
-            </w:r>
-          </w:p>
-        </w:tc>
-        <w:tc>
-          <w:tcPr>
-            <w:tcW w:type="dxa" w:w="893"/>
-            <w:vAlign w:val="center"/>
-          </w:tcPr>
-          <w:p>
-            <w:pPr>
-              <w:jc w:val="right"/>
-            </w:pPr>
-            <w:r>
-              <w:rPr>
-                <w:b/>
-                <w:sz w:val="18"/>
-              </w:rPr>
-              <w:t>10.48</w:t>
+              <w:t>0.2 rush att · 0 rush yds · 0.00 rush TD · 6.0 tgt · 4.6 rec · 38 rec yds · 0.36 rec TD</w:t>
+            </w:r>
+          </w:p>
+        </w:tc>
+        <w:tc>
+          <w:tcPr>
+            <w:tcW w:type="dxa" w:w="893"/>
+            <w:vAlign w:val="center"/>
+          </w:tcPr>
+          <w:p>
+            <w:pPr>
+              <w:jc w:val="right"/>
+            </w:pPr>
+            <w:r>
+              <w:rPr>
+                <w:sz w:val="18"/>
+              </w:rPr>
+              <w:t>5.95</w:t>
+            </w:r>
+          </w:p>
+        </w:tc>
+        <w:tc>
+          <w:tcPr>
+            <w:tcW w:type="dxa" w:w="893"/>
+            <w:vAlign w:val="center"/>
+          </w:tcPr>
+          <w:p>
+            <w:pPr>
+              <w:jc w:val="right"/>
+            </w:pPr>
+            <w:r>
+              <w:rPr>
+                <w:sz w:val="18"/>
+              </w:rPr>
+              <w:t>8.25</w:t>
+            </w:r>
+          </w:p>
+        </w:tc>
+        <w:tc>
+          <w:tcPr>
+            <w:tcW w:type="dxa" w:w="893"/>
+            <w:vAlign w:val="center"/>
+          </w:tcPr>
+          <w:p>
+            <w:pPr>
+              <w:jc w:val="right"/>
+            </w:pPr>
+            <w:r>
+              <w:rPr>
+                <w:b/>
+                <w:sz w:val="18"/>
+              </w:rPr>
+              <w:t>10.54</w:t>
             </w:r>
           </w:p>
         </w:tc>
@@ -9854,7 +9854,7 @@
                 <w:b/>
                 <w:sz w:val="20"/>
               </w:rPr>
-              <w:t>Keenan Allen</w:t>
+              <w:t>Carnell Tate</w:t>
             </w:r>
           </w:p>
           <w:p>
@@ -9866,62 +9866,62 @@
                 <w:color w:val="657589"/>
                 <w:sz w:val="16"/>
               </w:rPr>
-              <w:t>0.1 rush att · 0 rush yds · 0.00 rush TD · 7.6 tgt · 4.7 rec · 40 rec yds · 0.24 rec TD</w:t>
-            </w:r>
-          </w:p>
-        </w:tc>
-        <w:tc>
-          <w:tcPr>
-            <w:tcW w:type="dxa" w:w="893"/>
-            <w:vAlign w:val="center"/>
-            <w:shd w:fill="F2F5F8"/>
-          </w:tcPr>
-          <w:p>
-            <w:pPr>
-              <w:jc w:val="right"/>
-            </w:pPr>
-            <w:r>
-              <w:rPr>
-                <w:sz w:val="18"/>
-              </w:rPr>
-              <w:t>5.53</w:t>
-            </w:r>
-          </w:p>
-        </w:tc>
-        <w:tc>
-          <w:tcPr>
-            <w:tcW w:type="dxa" w:w="893"/>
-            <w:vAlign w:val="center"/>
-            <w:shd w:fill="F2F5F8"/>
-          </w:tcPr>
-          <w:p>
-            <w:pPr>
-              <w:jc w:val="right"/>
-            </w:pPr>
-            <w:r>
-              <w:rPr>
-                <w:sz w:val="18"/>
-              </w:rPr>
-              <w:t>7.86</w:t>
-            </w:r>
-          </w:p>
-        </w:tc>
-        <w:tc>
-          <w:tcPr>
-            <w:tcW w:type="dxa" w:w="893"/>
-            <w:vAlign w:val="center"/>
-            <w:shd w:fill="F2F5F8"/>
-          </w:tcPr>
-          <w:p>
-            <w:pPr>
-              <w:jc w:val="right"/>
-            </w:pPr>
-            <w:r>
-              <w:rPr>
-                <w:b/>
-                <w:sz w:val="18"/>
-              </w:rPr>
-              <w:t>10.20</w:t>
+              <w:t>0.1 rush att · 0 rush yds · 0.00 rush TD · 8.1 tgt · 4.5 rec · 57 rec yds · 0.04 rec TD</w:t>
+            </w:r>
+          </w:p>
+        </w:tc>
+        <w:tc>
+          <w:tcPr>
+            <w:tcW w:type="dxa" w:w="893"/>
+            <w:vAlign w:val="center"/>
+            <w:shd w:fill="F2F5F8"/>
+          </w:tcPr>
+          <w:p>
+            <w:pPr>
+              <w:jc w:val="right"/>
+            </w:pPr>
+            <w:r>
+              <w:rPr>
+                <w:sz w:val="18"/>
+              </w:rPr>
+              <w:t>6.00</w:t>
+            </w:r>
+          </w:p>
+        </w:tc>
+        <w:tc>
+          <w:tcPr>
+            <w:tcW w:type="dxa" w:w="893"/>
+            <w:vAlign w:val="center"/>
+            <w:shd w:fill="F2F5F8"/>
+          </w:tcPr>
+          <w:p>
+            <w:pPr>
+              <w:jc w:val="right"/>
+            </w:pPr>
+            <w:r>
+              <w:rPr>
+                <w:sz w:val="18"/>
+              </w:rPr>
+              <w:t>8.24</w:t>
+            </w:r>
+          </w:p>
+        </w:tc>
+        <w:tc>
+          <w:tcPr>
+            <w:tcW w:type="dxa" w:w="893"/>
+            <w:vAlign w:val="center"/>
+            <w:shd w:fill="F2F5F8"/>
+          </w:tcPr>
+          <w:p>
+            <w:pPr>
+              <w:jc w:val="right"/>
+            </w:pPr>
+            <w:r>
+              <w:rPr>
+                <w:b/>
+                <w:sz w:val="18"/>
+              </w:rPr>
+              <w:t>10.48</w:t>
             </w:r>
           </w:p>
         </w:tc>
@@ -9941,7 +9941,7 @@
                 <w:b/>
                 <w:sz w:val="20"/>
               </w:rPr>
-              <w:t>Ryan Flournoy</w:t>
+              <w:t>Keenan Allen</w:t>
             </w:r>
           </w:p>
           <w:p>
@@ -9953,59 +9953,59 @@
                 <w:color w:val="657589"/>
                 <w:sz w:val="16"/>
               </w:rPr>
-              <w:t>0.1 rush att · 0 rush yds · 0.00 rush TD · 5.6 tgt · 3.6 rec · 63 rec yds · 0.03 rec TD</w:t>
-            </w:r>
-          </w:p>
-        </w:tc>
-        <w:tc>
-          <w:tcPr>
-            <w:tcW w:type="dxa" w:w="893"/>
-            <w:vAlign w:val="center"/>
-          </w:tcPr>
-          <w:p>
-            <w:pPr>
-              <w:jc w:val="right"/>
-            </w:pPr>
-            <w:r>
-              <w:rPr>
-                <w:sz w:val="18"/>
-              </w:rPr>
-              <w:t>6.53</w:t>
-            </w:r>
-          </w:p>
-        </w:tc>
-        <w:tc>
-          <w:tcPr>
-            <w:tcW w:type="dxa" w:w="893"/>
-            <w:vAlign w:val="center"/>
-          </w:tcPr>
-          <w:p>
-            <w:pPr>
-              <w:jc w:val="right"/>
-            </w:pPr>
-            <w:r>
-              <w:rPr>
-                <w:sz w:val="18"/>
-              </w:rPr>
-              <w:t>8.32</w:t>
-            </w:r>
-          </w:p>
-        </w:tc>
-        <w:tc>
-          <w:tcPr>
-            <w:tcW w:type="dxa" w:w="893"/>
-            <w:vAlign w:val="center"/>
-          </w:tcPr>
-          <w:p>
-            <w:pPr>
-              <w:jc w:val="right"/>
-            </w:pPr>
-            <w:r>
-              <w:rPr>
-                <w:b/>
-                <w:sz w:val="18"/>
-              </w:rPr>
-              <w:t>10.11</w:t>
+              <w:t>0.1 rush att · 0 rush yds · 0.00 rush TD · 7.6 tgt · 4.7 rec · 40 rec yds · 0.24 rec TD</w:t>
+            </w:r>
+          </w:p>
+        </w:tc>
+        <w:tc>
+          <w:tcPr>
+            <w:tcW w:type="dxa" w:w="893"/>
+            <w:vAlign w:val="center"/>
+          </w:tcPr>
+          <w:p>
+            <w:pPr>
+              <w:jc w:val="right"/>
+            </w:pPr>
+            <w:r>
+              <w:rPr>
+                <w:sz w:val="18"/>
+              </w:rPr>
+              <w:t>5.53</w:t>
+            </w:r>
+          </w:p>
+        </w:tc>
+        <w:tc>
+          <w:tcPr>
+            <w:tcW w:type="dxa" w:w="893"/>
+            <w:vAlign w:val="center"/>
+          </w:tcPr>
+          <w:p>
+            <w:pPr>
+              <w:jc w:val="right"/>
+            </w:pPr>
+            <w:r>
+              <w:rPr>
+                <w:sz w:val="18"/>
+              </w:rPr>
+              <w:t>7.86</w:t>
+            </w:r>
+          </w:p>
+        </w:tc>
+        <w:tc>
+          <w:tcPr>
+            <w:tcW w:type="dxa" w:w="893"/>
+            <w:vAlign w:val="center"/>
+          </w:tcPr>
+          <w:p>
+            <w:pPr>
+              <w:jc w:val="right"/>
+            </w:pPr>
+            <w:r>
+              <w:rPr>
+                <w:b/>
+                <w:sz w:val="18"/>
+              </w:rPr>
+              <w:t>10.20</w:t>
             </w:r>
           </w:p>
         </w:tc>
@@ -10026,7 +10026,7 @@
                 <w:b/>
                 <w:sz w:val="20"/>
               </w:rPr>
-              <w:t>Khalil Shakir</w:t>
+              <w:t>Ryan Flournoy</w:t>
             </w:r>
           </w:p>
           <w:p>
@@ -10038,62 +10038,62 @@
                 <w:color w:val="657589"/>
                 <w:sz w:val="16"/>
               </w:rPr>
-              <w:t>0.1 rush att · 0 rush yds · 0.00 rush TD · 4.5 tgt · 3.7 rec · 62 rec yds · 0.02 rec TD</w:t>
-            </w:r>
-          </w:p>
-        </w:tc>
-        <w:tc>
-          <w:tcPr>
-            <w:tcW w:type="dxa" w:w="893"/>
-            <w:vAlign w:val="center"/>
-            <w:shd w:fill="F2F5F8"/>
-          </w:tcPr>
-          <w:p>
-            <w:pPr>
-              <w:jc w:val="right"/>
-            </w:pPr>
-            <w:r>
-              <w:rPr>
-                <w:sz w:val="18"/>
-              </w:rPr>
-              <w:t>6.43</w:t>
-            </w:r>
-          </w:p>
-        </w:tc>
-        <w:tc>
-          <w:tcPr>
-            <w:tcW w:type="dxa" w:w="893"/>
-            <w:vAlign w:val="center"/>
-            <w:shd w:fill="F2F5F8"/>
-          </w:tcPr>
-          <w:p>
-            <w:pPr>
-              <w:jc w:val="right"/>
-            </w:pPr>
-            <w:r>
-              <w:rPr>
-                <w:sz w:val="18"/>
-              </w:rPr>
-              <w:t>8.26</w:t>
-            </w:r>
-          </w:p>
-        </w:tc>
-        <w:tc>
-          <w:tcPr>
-            <w:tcW w:type="dxa" w:w="893"/>
-            <w:vAlign w:val="center"/>
-            <w:shd w:fill="F2F5F8"/>
-          </w:tcPr>
-          <w:p>
-            <w:pPr>
-              <w:jc w:val="right"/>
-            </w:pPr>
-            <w:r>
-              <w:rPr>
-                <w:b/>
-                <w:sz w:val="18"/>
-              </w:rPr>
-              <w:t>10.09</w:t>
+              <w:t>0.1 rush att · 0 rush yds · 0.00 rush TD · 5.6 tgt · 3.6 rec · 63 rec yds · 0.03 rec TD</w:t>
+            </w:r>
+          </w:p>
+        </w:tc>
+        <w:tc>
+          <w:tcPr>
+            <w:tcW w:type="dxa" w:w="893"/>
+            <w:vAlign w:val="center"/>
+            <w:shd w:fill="F2F5F8"/>
+          </w:tcPr>
+          <w:p>
+            <w:pPr>
+              <w:jc w:val="right"/>
+            </w:pPr>
+            <w:r>
+              <w:rPr>
+                <w:sz w:val="18"/>
+              </w:rPr>
+              <w:t>6.53</w:t>
+            </w:r>
+          </w:p>
+        </w:tc>
+        <w:tc>
+          <w:tcPr>
+            <w:tcW w:type="dxa" w:w="893"/>
+            <w:vAlign w:val="center"/>
+            <w:shd w:fill="F2F5F8"/>
+          </w:tcPr>
+          <w:p>
+            <w:pPr>
+              <w:jc w:val="right"/>
+            </w:pPr>
+            <w:r>
+              <w:rPr>
+                <w:sz w:val="18"/>
+              </w:rPr>
+              <w:t>8.32</w:t>
+            </w:r>
+          </w:p>
+        </w:tc>
+        <w:tc>
+          <w:tcPr>
+            <w:tcW w:type="dxa" w:w="893"/>
+            <w:vAlign w:val="center"/>
+            <w:shd w:fill="F2F5F8"/>
+          </w:tcPr>
+          <w:p>
+            <w:pPr>
+              <w:jc w:val="right"/>
+            </w:pPr>
+            <w:r>
+              <w:rPr>
+                <w:b/>
+                <w:sz w:val="18"/>
+              </w:rPr>
+              <w:t>10.11</w:t>
             </w:r>
           </w:p>
         </w:tc>
@@ -10113,7 +10113,7 @@
                 <w:b/>
                 <w:sz w:val="20"/>
               </w:rPr>
-              <w:t>Deebo Samuel Sr.</w:t>
+              <w:t>Khalil Shakir</w:t>
             </w:r>
           </w:p>
           <w:p>
@@ -10125,59 +10125,59 @@
                 <w:color w:val="657589"/>
                 <w:sz w:val="16"/>
               </w:rPr>
-              <w:t>1.3 rush att · 9 rush yds · 0.01 rush TD · 3.8 tgt · 2.9 rec · 33 rec yds · 0.47 rec TD</w:t>
-            </w:r>
-          </w:p>
-        </w:tc>
-        <w:tc>
-          <w:tcPr>
-            <w:tcW w:type="dxa" w:w="893"/>
-            <w:vAlign w:val="center"/>
-          </w:tcPr>
-          <w:p>
-            <w:pPr>
-              <w:jc w:val="right"/>
-            </w:pPr>
-            <w:r>
-              <w:rPr>
-                <w:sz w:val="18"/>
-              </w:rPr>
-              <w:t>7.11</w:t>
-            </w:r>
-          </w:p>
-        </w:tc>
-        <w:tc>
-          <w:tcPr>
-            <w:tcW w:type="dxa" w:w="893"/>
-            <w:vAlign w:val="center"/>
-          </w:tcPr>
-          <w:p>
-            <w:pPr>
-              <w:jc w:val="right"/>
-            </w:pPr>
-            <w:r>
-              <w:rPr>
-                <w:sz w:val="18"/>
-              </w:rPr>
-              <w:t>8.56</w:t>
-            </w:r>
-          </w:p>
-        </w:tc>
-        <w:tc>
-          <w:tcPr>
-            <w:tcW w:type="dxa" w:w="893"/>
-            <w:vAlign w:val="center"/>
-          </w:tcPr>
-          <w:p>
-            <w:pPr>
-              <w:jc w:val="right"/>
-            </w:pPr>
-            <w:r>
-              <w:rPr>
-                <w:b/>
-                <w:sz w:val="18"/>
-              </w:rPr>
-              <w:t>10.01</w:t>
+              <w:t>0.1 rush att · 0 rush yds · 0.00 rush TD · 4.5 tgt · 3.7 rec · 62 rec yds · 0.02 rec TD</w:t>
+            </w:r>
+          </w:p>
+        </w:tc>
+        <w:tc>
+          <w:tcPr>
+            <w:tcW w:type="dxa" w:w="893"/>
+            <w:vAlign w:val="center"/>
+          </w:tcPr>
+          <w:p>
+            <w:pPr>
+              <w:jc w:val="right"/>
+            </w:pPr>
+            <w:r>
+              <w:rPr>
+                <w:sz w:val="18"/>
+              </w:rPr>
+              <w:t>6.43</w:t>
+            </w:r>
+          </w:p>
+        </w:tc>
+        <w:tc>
+          <w:tcPr>
+            <w:tcW w:type="dxa" w:w="893"/>
+            <w:vAlign w:val="center"/>
+          </w:tcPr>
+          <w:p>
+            <w:pPr>
+              <w:jc w:val="right"/>
+            </w:pPr>
+            <w:r>
+              <w:rPr>
+                <w:sz w:val="18"/>
+              </w:rPr>
+              <w:t>8.26</w:t>
+            </w:r>
+          </w:p>
+        </w:tc>
+        <w:tc>
+          <w:tcPr>
+            <w:tcW w:type="dxa" w:w="893"/>
+            <w:vAlign w:val="center"/>
+          </w:tcPr>
+          <w:p>
+            <w:pPr>
+              <w:jc w:val="right"/>
+            </w:pPr>
+            <w:r>
+              <w:rPr>
+                <w:b/>
+                <w:sz w:val="18"/>
+              </w:rPr>
+              <w:t>10.09</w:t>
             </w:r>
           </w:p>
         </w:tc>
@@ -10198,7 +10198,7 @@
                 <w:b/>
                 <w:sz w:val="20"/>
               </w:rPr>
-              <w:t>Keon Coleman</w:t>
+              <w:t>Deebo Samuel Sr.</w:t>
             </w:r>
           </w:p>
           <w:p>
@@ -10210,62 +10210,62 @@
                 <w:color w:val="657589"/>
                 <w:sz w:val="16"/>
               </w:rPr>
-              <w:t>0.1 rush att · 0 rush yds · 0.00 rush TD · 3.4 tgt · 2.6 rec · 41 rec yds · 0.51 rec TD</w:t>
-            </w:r>
-          </w:p>
-        </w:tc>
-        <w:tc>
-          <w:tcPr>
-            <w:tcW w:type="dxa" w:w="893"/>
-            <w:vAlign w:val="center"/>
-            <w:shd w:fill="F2F5F8"/>
-          </w:tcPr>
-          <w:p>
-            <w:pPr>
-              <w:jc w:val="right"/>
-            </w:pPr>
-            <w:r>
-              <w:rPr>
-                <w:sz w:val="18"/>
-              </w:rPr>
-              <w:t>7.23</w:t>
-            </w:r>
-          </w:p>
-        </w:tc>
-        <w:tc>
-          <w:tcPr>
-            <w:tcW w:type="dxa" w:w="893"/>
-            <w:vAlign w:val="center"/>
-            <w:shd w:fill="F2F5F8"/>
-          </w:tcPr>
-          <w:p>
-            <w:pPr>
-              <w:jc w:val="right"/>
-            </w:pPr>
-            <w:r>
-              <w:rPr>
-                <w:sz w:val="18"/>
-              </w:rPr>
-              <w:t>8.51</w:t>
-            </w:r>
-          </w:p>
-        </w:tc>
-        <w:tc>
-          <w:tcPr>
-            <w:tcW w:type="dxa" w:w="893"/>
-            <w:vAlign w:val="center"/>
-            <w:shd w:fill="F2F5F8"/>
-          </w:tcPr>
-          <w:p>
-            <w:pPr>
-              <w:jc w:val="right"/>
-            </w:pPr>
-            <w:r>
-              <w:rPr>
-                <w:b/>
-                <w:sz w:val="18"/>
-              </w:rPr>
-              <w:t>9.79</w:t>
+              <w:t>1.3 rush att · 9 rush yds · 0.01 rush TD · 3.8 tgt · 2.9 rec · 33 rec yds · 0.47 rec TD</w:t>
+            </w:r>
+          </w:p>
+        </w:tc>
+        <w:tc>
+          <w:tcPr>
+            <w:tcW w:type="dxa" w:w="893"/>
+            <w:vAlign w:val="center"/>
+            <w:shd w:fill="F2F5F8"/>
+          </w:tcPr>
+          <w:p>
+            <w:pPr>
+              <w:jc w:val="right"/>
+            </w:pPr>
+            <w:r>
+              <w:rPr>
+                <w:sz w:val="18"/>
+              </w:rPr>
+              <w:t>7.11</w:t>
+            </w:r>
+          </w:p>
+        </w:tc>
+        <w:tc>
+          <w:tcPr>
+            <w:tcW w:type="dxa" w:w="893"/>
+            <w:vAlign w:val="center"/>
+            <w:shd w:fill="F2F5F8"/>
+          </w:tcPr>
+          <w:p>
+            <w:pPr>
+              <w:jc w:val="right"/>
+            </w:pPr>
+            <w:r>
+              <w:rPr>
+                <w:sz w:val="18"/>
+              </w:rPr>
+              <w:t>8.56</w:t>
+            </w:r>
+          </w:p>
+        </w:tc>
+        <w:tc>
+          <w:tcPr>
+            <w:tcW w:type="dxa" w:w="893"/>
+            <w:vAlign w:val="center"/>
+            <w:shd w:fill="F2F5F8"/>
+          </w:tcPr>
+          <w:p>
+            <w:pPr>
+              <w:jc w:val="right"/>
+            </w:pPr>
+            <w:r>
+              <w:rPr>
+                <w:b/>
+                <w:sz w:val="18"/>
+              </w:rPr>
+              <w:t>10.01</w:t>
             </w:r>
           </w:p>
         </w:tc>
@@ -10285,7 +10285,7 @@
                 <w:b/>
                 <w:sz w:val="20"/>
               </w:rPr>
-              <w:t>Terry McLaurin</w:t>
+              <w:t>Keon Coleman</w:t>
             </w:r>
           </w:p>
           <w:p>
@@ -10297,59 +10297,59 @@
                 <w:color w:val="657589"/>
                 <w:sz w:val="16"/>
               </w:rPr>
-              <w:t>0.1 rush att · 0 rush yds · 0.00 rush TD · 5.2 tgt · 3.4 rec · 49 rec yds · 0.22 rec TD</w:t>
-            </w:r>
-          </w:p>
-        </w:tc>
-        <w:tc>
-          <w:tcPr>
-            <w:tcW w:type="dxa" w:w="893"/>
-            <w:vAlign w:val="center"/>
-          </w:tcPr>
-          <w:p>
-            <w:pPr>
-              <w:jc w:val="right"/>
-            </w:pPr>
-            <w:r>
-              <w:rPr>
-                <w:sz w:val="18"/>
-              </w:rPr>
-              <w:t>6.26</w:t>
-            </w:r>
-          </w:p>
-        </w:tc>
-        <w:tc>
-          <w:tcPr>
-            <w:tcW w:type="dxa" w:w="893"/>
-            <w:vAlign w:val="center"/>
-          </w:tcPr>
-          <w:p>
-            <w:pPr>
-              <w:jc w:val="right"/>
-            </w:pPr>
-            <w:r>
-              <w:rPr>
-                <w:sz w:val="18"/>
-              </w:rPr>
-              <w:t>7.97</w:t>
-            </w:r>
-          </w:p>
-        </w:tc>
-        <w:tc>
-          <w:tcPr>
-            <w:tcW w:type="dxa" w:w="893"/>
-            <w:vAlign w:val="center"/>
-          </w:tcPr>
-          <w:p>
-            <w:pPr>
-              <w:jc w:val="right"/>
-            </w:pPr>
-            <w:r>
-              <w:rPr>
-                <w:b/>
-                <w:sz w:val="18"/>
-              </w:rPr>
-              <w:t>9.68</w:t>
+              <w:t>0.1 rush att · 0 rush yds · 0.00 rush TD · 3.4 tgt · 2.6 rec · 41 rec yds · 0.51 rec TD</w:t>
+            </w:r>
+          </w:p>
+        </w:tc>
+        <w:tc>
+          <w:tcPr>
+            <w:tcW w:type="dxa" w:w="893"/>
+            <w:vAlign w:val="center"/>
+          </w:tcPr>
+          <w:p>
+            <w:pPr>
+              <w:jc w:val="right"/>
+            </w:pPr>
+            <w:r>
+              <w:rPr>
+                <w:sz w:val="18"/>
+              </w:rPr>
+              <w:t>7.23</w:t>
+            </w:r>
+          </w:p>
+        </w:tc>
+        <w:tc>
+          <w:tcPr>
+            <w:tcW w:type="dxa" w:w="893"/>
+            <w:vAlign w:val="center"/>
+          </w:tcPr>
+          <w:p>
+            <w:pPr>
+              <w:jc w:val="right"/>
+            </w:pPr>
+            <w:r>
+              <w:rPr>
+                <w:sz w:val="18"/>
+              </w:rPr>
+              <w:t>8.51</w:t>
+            </w:r>
+          </w:p>
+        </w:tc>
+        <w:tc>
+          <w:tcPr>
+            <w:tcW w:type="dxa" w:w="893"/>
+            <w:vAlign w:val="center"/>
+          </w:tcPr>
+          <w:p>
+            <w:pPr>
+              <w:jc w:val="right"/>
+            </w:pPr>
+            <w:r>
+              <w:rPr>
+                <w:b/>
+                <w:sz w:val="18"/>
+              </w:rPr>
+              <w:t>9.79</w:t>
             </w:r>
           </w:p>
         </w:tc>
@@ -10370,7 +10370,7 @@
                 <w:b/>
                 <w:sz w:val="20"/>
               </w:rPr>
-              <w:t>Jakobi Meyers</w:t>
+              <w:t>Terry McLaurin</w:t>
             </w:r>
           </w:p>
           <w:p>
@@ -10382,62 +10382,62 @@
                 <w:color w:val="657589"/>
                 <w:sz w:val="16"/>
               </w:rPr>
-              <w:t>0.2 rush att · 0 rush yds · 0.00 rush TD · 4.3 tgt · 3.3 rec · 46 rec yds · 0.26 rec TD</w:t>
-            </w:r>
-          </w:p>
-        </w:tc>
-        <w:tc>
-          <w:tcPr>
-            <w:tcW w:type="dxa" w:w="893"/>
-            <w:vAlign w:val="center"/>
-            <w:shd w:fill="F2F5F8"/>
-          </w:tcPr>
-          <w:p>
-            <w:pPr>
-              <w:jc w:val="right"/>
-            </w:pPr>
-            <w:r>
-              <w:rPr>
-                <w:sz w:val="18"/>
-              </w:rPr>
-              <w:t>6.21</w:t>
-            </w:r>
-          </w:p>
-        </w:tc>
-        <w:tc>
-          <w:tcPr>
-            <w:tcW w:type="dxa" w:w="893"/>
-            <w:vAlign w:val="center"/>
-            <w:shd w:fill="F2F5F8"/>
-          </w:tcPr>
-          <w:p>
-            <w:pPr>
-              <w:jc w:val="right"/>
-            </w:pPr>
-            <w:r>
-              <w:rPr>
-                <w:sz w:val="18"/>
-              </w:rPr>
-              <w:t>7.87</w:t>
-            </w:r>
-          </w:p>
-        </w:tc>
-        <w:tc>
-          <w:tcPr>
-            <w:tcW w:type="dxa" w:w="893"/>
-            <w:vAlign w:val="center"/>
-            <w:shd w:fill="F2F5F8"/>
-          </w:tcPr>
-          <w:p>
-            <w:pPr>
-              <w:jc w:val="right"/>
-            </w:pPr>
-            <w:r>
-              <w:rPr>
-                <w:b/>
-                <w:sz w:val="18"/>
-              </w:rPr>
-              <w:t>9.52</w:t>
+              <w:t>0.1 rush att · 0 rush yds · 0.00 rush TD · 5.2 tgt · 3.4 rec · 49 rec yds · 0.22 rec TD</w:t>
+            </w:r>
+          </w:p>
+        </w:tc>
+        <w:tc>
+          <w:tcPr>
+            <w:tcW w:type="dxa" w:w="893"/>
+            <w:vAlign w:val="center"/>
+            <w:shd w:fill="F2F5F8"/>
+          </w:tcPr>
+          <w:p>
+            <w:pPr>
+              <w:jc w:val="right"/>
+            </w:pPr>
+            <w:r>
+              <w:rPr>
+                <w:sz w:val="18"/>
+              </w:rPr>
+              <w:t>6.26</w:t>
+            </w:r>
+          </w:p>
+        </w:tc>
+        <w:tc>
+          <w:tcPr>
+            <w:tcW w:type="dxa" w:w="893"/>
+            <w:vAlign w:val="center"/>
+            <w:shd w:fill="F2F5F8"/>
+          </w:tcPr>
+          <w:p>
+            <w:pPr>
+              <w:jc w:val="right"/>
+            </w:pPr>
+            <w:r>
+              <w:rPr>
+                <w:sz w:val="18"/>
+              </w:rPr>
+              <w:t>7.97</w:t>
+            </w:r>
+          </w:p>
+        </w:tc>
+        <w:tc>
+          <w:tcPr>
+            <w:tcW w:type="dxa" w:w="893"/>
+            <w:vAlign w:val="center"/>
+            <w:shd w:fill="F2F5F8"/>
+          </w:tcPr>
+          <w:p>
+            <w:pPr>
+              <w:jc w:val="right"/>
+            </w:pPr>
+            <w:r>
+              <w:rPr>
+                <w:b/>
+                <w:sz w:val="18"/>
+              </w:rPr>
+              <w:t>9.68</w:t>
             </w:r>
           </w:p>
         </w:tc>
@@ -10457,7 +10457,7 @@
                 <w:b/>
                 <w:sz w:val="20"/>
               </w:rPr>
-              <w:t>Xavier Hutchinson</w:t>
+              <w:t>Jakobi Meyers</w:t>
             </w:r>
           </w:p>
           <w:p>
@@ -10469,59 +10469,59 @@
                 <w:color w:val="657589"/>
                 <w:sz w:val="16"/>
               </w:rPr>
-              <w:t>0.3 rush att · 1 rush yds · 0.00 rush TD · 5.7 tgt · 3.6 rec · 56 rec yds · 0.03 rec TD</w:t>
-            </w:r>
-          </w:p>
-        </w:tc>
-        <w:tc>
-          <w:tcPr>
-            <w:tcW w:type="dxa" w:w="893"/>
-            <w:vAlign w:val="center"/>
-          </w:tcPr>
-          <w:p>
-            <w:pPr>
-              <w:jc w:val="right"/>
-            </w:pPr>
-            <w:r>
-              <w:rPr>
-                <w:sz w:val="18"/>
-              </w:rPr>
-              <w:t>5.82</w:t>
-            </w:r>
-          </w:p>
-        </w:tc>
-        <w:tc>
-          <w:tcPr>
-            <w:tcW w:type="dxa" w:w="893"/>
-            <w:vAlign w:val="center"/>
-          </w:tcPr>
-          <w:p>
-            <w:pPr>
-              <w:jc w:val="right"/>
-            </w:pPr>
-            <w:r>
-              <w:rPr>
-                <w:sz w:val="18"/>
-              </w:rPr>
-              <w:t>7.61</w:t>
-            </w:r>
-          </w:p>
-        </w:tc>
-        <w:tc>
-          <w:tcPr>
-            <w:tcW w:type="dxa" w:w="893"/>
-            <w:vAlign w:val="center"/>
-          </w:tcPr>
-          <w:p>
-            <w:pPr>
-              <w:jc w:val="right"/>
-            </w:pPr>
-            <w:r>
-              <w:rPr>
-                <w:b/>
-                <w:sz w:val="18"/>
-              </w:rPr>
-              <w:t>9.40</w:t>
+              <w:t>0.2 rush att · 0 rush yds · 0.00 rush TD · 4.3 tgt · 3.3 rec · 46 rec yds · 0.26 rec TD</w:t>
+            </w:r>
+          </w:p>
+        </w:tc>
+        <w:tc>
+          <w:tcPr>
+            <w:tcW w:type="dxa" w:w="893"/>
+            <w:vAlign w:val="center"/>
+          </w:tcPr>
+          <w:p>
+            <w:pPr>
+              <w:jc w:val="right"/>
+            </w:pPr>
+            <w:r>
+              <w:rPr>
+                <w:sz w:val="18"/>
+              </w:rPr>
+              <w:t>6.21</w:t>
+            </w:r>
+          </w:p>
+        </w:tc>
+        <w:tc>
+          <w:tcPr>
+            <w:tcW w:type="dxa" w:w="893"/>
+            <w:vAlign w:val="center"/>
+          </w:tcPr>
+          <w:p>
+            <w:pPr>
+              <w:jc w:val="right"/>
+            </w:pPr>
+            <w:r>
+              <w:rPr>
+                <w:sz w:val="18"/>
+              </w:rPr>
+              <w:t>7.87</w:t>
+            </w:r>
+          </w:p>
+        </w:tc>
+        <w:tc>
+          <w:tcPr>
+            <w:tcW w:type="dxa" w:w="893"/>
+            <w:vAlign w:val="center"/>
+          </w:tcPr>
+          <w:p>
+            <w:pPr>
+              <w:jc w:val="right"/>
+            </w:pPr>
+            <w:r>
+              <w:rPr>
+                <w:b/>
+                <w:sz w:val="18"/>
+              </w:rPr>
+              <w:t>9.52</w:t>
             </w:r>
           </w:p>
         </w:tc>
@@ -10542,7 +10542,7 @@
                 <w:b/>
                 <w:sz w:val="20"/>
               </w:rPr>
-              <w:t>Josh Downs</w:t>
+              <w:t>Xavier Hutchinson</w:t>
             </w:r>
           </w:p>
           <w:p>
@@ -10554,62 +10554,62 @@
                 <w:color w:val="657589"/>
                 <w:sz w:val="16"/>
               </w:rPr>
-              <w:t>0.1 rush att · 0 rush yds · 0.00 rush TD · 7.1 tgt · 4.0 rec · 51 rec yds · 0.04 rec TD</w:t>
-            </w:r>
-          </w:p>
-        </w:tc>
-        <w:tc>
-          <w:tcPr>
-            <w:tcW w:type="dxa" w:w="893"/>
-            <w:vAlign w:val="center"/>
-            <w:shd w:fill="F2F5F8"/>
-          </w:tcPr>
-          <w:p>
-            <w:pPr>
-              <w:jc w:val="right"/>
-            </w:pPr>
-            <w:r>
-              <w:rPr>
-                <w:sz w:val="18"/>
-              </w:rPr>
-              <w:t>5.35</w:t>
-            </w:r>
-          </w:p>
-        </w:tc>
-        <w:tc>
-          <w:tcPr>
-            <w:tcW w:type="dxa" w:w="893"/>
-            <w:vAlign w:val="center"/>
-            <w:shd w:fill="F2F5F8"/>
-          </w:tcPr>
-          <w:p>
-            <w:pPr>
-              <w:jc w:val="right"/>
-            </w:pPr>
-            <w:r>
-              <w:rPr>
-                <w:sz w:val="18"/>
-              </w:rPr>
-              <w:t>7.33</w:t>
-            </w:r>
-          </w:p>
-        </w:tc>
-        <w:tc>
-          <w:tcPr>
-            <w:tcW w:type="dxa" w:w="893"/>
-            <w:vAlign w:val="center"/>
-            <w:shd w:fill="F2F5F8"/>
-          </w:tcPr>
-          <w:p>
-            <w:pPr>
-              <w:jc w:val="right"/>
-            </w:pPr>
-            <w:r>
-              <w:rPr>
-                <w:b/>
-                <w:sz w:val="18"/>
-              </w:rPr>
-              <w:t>9.31</w:t>
+              <w:t>0.3 rush att · 1 rush yds · 0.00 rush TD · 5.7 tgt · 3.6 rec · 56 rec yds · 0.03 rec TD</w:t>
+            </w:r>
+          </w:p>
+        </w:tc>
+        <w:tc>
+          <w:tcPr>
+            <w:tcW w:type="dxa" w:w="893"/>
+            <w:vAlign w:val="center"/>
+            <w:shd w:fill="F2F5F8"/>
+          </w:tcPr>
+          <w:p>
+            <w:pPr>
+              <w:jc w:val="right"/>
+            </w:pPr>
+            <w:r>
+              <w:rPr>
+                <w:sz w:val="18"/>
+              </w:rPr>
+              <w:t>5.82</w:t>
+            </w:r>
+          </w:p>
+        </w:tc>
+        <w:tc>
+          <w:tcPr>
+            <w:tcW w:type="dxa" w:w="893"/>
+            <w:vAlign w:val="center"/>
+            <w:shd w:fill="F2F5F8"/>
+          </w:tcPr>
+          <w:p>
+            <w:pPr>
+              <w:jc w:val="right"/>
+            </w:pPr>
+            <w:r>
+              <w:rPr>
+                <w:sz w:val="18"/>
+              </w:rPr>
+              <w:t>7.61</w:t>
+            </w:r>
+          </w:p>
+        </w:tc>
+        <w:tc>
+          <w:tcPr>
+            <w:tcW w:type="dxa" w:w="893"/>
+            <w:vAlign w:val="center"/>
+            <w:shd w:fill="F2F5F8"/>
+          </w:tcPr>
+          <w:p>
+            <w:pPr>
+              <w:jc w:val="right"/>
+            </w:pPr>
+            <w:r>
+              <w:rPr>
+                <w:b/>
+                <w:sz w:val="18"/>
+              </w:rPr>
+              <w:t>9.40</w:t>
             </w:r>
           </w:p>
         </w:tc>
@@ -10629,7 +10629,7 @@
                 <w:b/>
                 <w:sz w:val="20"/>
               </w:rPr>
-              <w:t>Romeo Doubs</w:t>
+              <w:t>Josh Downs</w:t>
             </w:r>
           </w:p>
           <w:p>
@@ -10641,59 +10641,59 @@
                 <w:color w:val="657589"/>
                 <w:sz w:val="16"/>
               </w:rPr>
-              <w:t>0.1 rush att · 0 rush yds · 0.00 rush TD · 4.8 tgt · 2.6 rec · 36 rec yds · 0.50 rec TD</w:t>
-            </w:r>
-          </w:p>
-        </w:tc>
-        <w:tc>
-          <w:tcPr>
-            <w:tcW w:type="dxa" w:w="893"/>
-            <w:vAlign w:val="center"/>
-          </w:tcPr>
-          <w:p>
-            <w:pPr>
-              <w:jc w:val="right"/>
-            </w:pPr>
-            <w:r>
-              <w:rPr>
-                <w:sz w:val="18"/>
-              </w:rPr>
-              <w:t>6.65</w:t>
-            </w:r>
-          </w:p>
-        </w:tc>
-        <w:tc>
-          <w:tcPr>
-            <w:tcW w:type="dxa" w:w="893"/>
-            <w:vAlign w:val="center"/>
-          </w:tcPr>
-          <w:p>
-            <w:pPr>
-              <w:jc w:val="right"/>
-            </w:pPr>
-            <w:r>
-              <w:rPr>
-                <w:sz w:val="18"/>
-              </w:rPr>
-              <w:t>7.96</w:t>
-            </w:r>
-          </w:p>
-        </w:tc>
-        <w:tc>
-          <w:tcPr>
-            <w:tcW w:type="dxa" w:w="893"/>
-            <w:vAlign w:val="center"/>
-          </w:tcPr>
-          <w:p>
-            <w:pPr>
-              <w:jc w:val="right"/>
-            </w:pPr>
-            <w:r>
-              <w:rPr>
-                <w:b/>
-                <w:sz w:val="18"/>
-              </w:rPr>
-              <w:t>9.26</w:t>
+              <w:t>0.1 rush att · 0 rush yds · 0.00 rush TD · 7.1 tgt · 4.0 rec · 51 rec yds · 0.04 rec TD</w:t>
+            </w:r>
+          </w:p>
+        </w:tc>
+        <w:tc>
+          <w:tcPr>
+            <w:tcW w:type="dxa" w:w="893"/>
+            <w:vAlign w:val="center"/>
+          </w:tcPr>
+          <w:p>
+            <w:pPr>
+              <w:jc w:val="right"/>
+            </w:pPr>
+            <w:r>
+              <w:rPr>
+                <w:sz w:val="18"/>
+              </w:rPr>
+              <w:t>5.35</w:t>
+            </w:r>
+          </w:p>
+        </w:tc>
+        <w:tc>
+          <w:tcPr>
+            <w:tcW w:type="dxa" w:w="893"/>
+            <w:vAlign w:val="center"/>
+          </w:tcPr>
+          <w:p>
+            <w:pPr>
+              <w:jc w:val="right"/>
+            </w:pPr>
+            <w:r>
+              <w:rPr>
+                <w:sz w:val="18"/>
+              </w:rPr>
+              <w:t>7.33</w:t>
+            </w:r>
+          </w:p>
+        </w:tc>
+        <w:tc>
+          <w:tcPr>
+            <w:tcW w:type="dxa" w:w="893"/>
+            <w:vAlign w:val="center"/>
+          </w:tcPr>
+          <w:p>
+            <w:pPr>
+              <w:jc w:val="right"/>
+            </w:pPr>
+            <w:r>
+              <w:rPr>
+                <w:b/>
+                <w:sz w:val="18"/>
+              </w:rPr>
+              <w:t>9.31</w:t>
             </w:r>
           </w:p>
         </w:tc>
@@ -10714,7 +10714,7 @@
                 <w:b/>
                 <w:sz w:val="20"/>
               </w:rPr>
-              <w:t>DK Metcalf</w:t>
+              <w:t>Kyle Williams</w:t>
             </w:r>
           </w:p>
           <w:p>
@@ -10726,62 +10726,62 @@
                 <w:color w:val="657589"/>
                 <w:sz w:val="16"/>
               </w:rPr>
-              <w:t>0.3 rush att · 2 rush yds · 0.00 rush TD · 6.4 tgt · 3.7 rec · 44 rec yds · 0.14 rec TD</w:t>
-            </w:r>
-          </w:p>
-        </w:tc>
-        <w:tc>
-          <w:tcPr>
-            <w:tcW w:type="dxa" w:w="893"/>
-            <w:vAlign w:val="center"/>
-            <w:shd w:fill="F2F5F8"/>
-          </w:tcPr>
-          <w:p>
-            <w:pPr>
-              <w:jc w:val="right"/>
-            </w:pPr>
-            <w:r>
-              <w:rPr>
-                <w:sz w:val="18"/>
-              </w:rPr>
-              <w:t>5.45</w:t>
-            </w:r>
-          </w:p>
-        </w:tc>
-        <w:tc>
-          <w:tcPr>
-            <w:tcW w:type="dxa" w:w="893"/>
-            <w:vAlign w:val="center"/>
-            <w:shd w:fill="F2F5F8"/>
-          </w:tcPr>
-          <w:p>
-            <w:pPr>
-              <w:jc w:val="right"/>
-            </w:pPr>
-            <w:r>
-              <w:rPr>
-                <w:sz w:val="18"/>
-              </w:rPr>
-              <w:t>7.31</w:t>
-            </w:r>
-          </w:p>
-        </w:tc>
-        <w:tc>
-          <w:tcPr>
-            <w:tcW w:type="dxa" w:w="893"/>
-            <w:vAlign w:val="center"/>
-            <w:shd w:fill="F2F5F8"/>
-          </w:tcPr>
-          <w:p>
-            <w:pPr>
-              <w:jc w:val="right"/>
-            </w:pPr>
-            <w:r>
-              <w:rPr>
-                <w:b/>
-                <w:sz w:val="18"/>
-              </w:rPr>
-              <w:t>9.17</w:t>
+              <w:t>0.1 rush att · 0 rush yds · 0.00 rush TD · 3.1 tgt · 2.0 rec · 44 rec yds · 0.47 rec TD</w:t>
+            </w:r>
+          </w:p>
+        </w:tc>
+        <w:tc>
+          <w:tcPr>
+            <w:tcW w:type="dxa" w:w="893"/>
+            <w:vAlign w:val="center"/>
+            <w:shd w:fill="F2F5F8"/>
+          </w:tcPr>
+          <w:p>
+            <w:pPr>
+              <w:jc w:val="right"/>
+            </w:pPr>
+            <w:r>
+              <w:rPr>
+                <w:sz w:val="18"/>
+              </w:rPr>
+              <w:t>7.26</w:t>
+            </w:r>
+          </w:p>
+        </w:tc>
+        <w:tc>
+          <w:tcPr>
+            <w:tcW w:type="dxa" w:w="893"/>
+            <w:vAlign w:val="center"/>
+            <w:shd w:fill="F2F5F8"/>
+          </w:tcPr>
+          <w:p>
+            <w:pPr>
+              <w:jc w:val="right"/>
+            </w:pPr>
+            <w:r>
+              <w:rPr>
+                <w:sz w:val="18"/>
+              </w:rPr>
+              <w:t>8.28</w:t>
+            </w:r>
+          </w:p>
+        </w:tc>
+        <w:tc>
+          <w:tcPr>
+            <w:tcW w:type="dxa" w:w="893"/>
+            <w:vAlign w:val="center"/>
+            <w:shd w:fill="F2F5F8"/>
+          </w:tcPr>
+          <w:p>
+            <w:pPr>
+              <w:jc w:val="right"/>
+            </w:pPr>
+            <w:r>
+              <w:rPr>
+                <w:b/>
+                <w:sz w:val="18"/>
+              </w:rPr>
+              <w:t>9.30</w:t>
             </w:r>
           </w:p>
         </w:tc>
@@ -10801,7 +10801,7 @@
                 <w:b/>
                 <w:sz w:val="20"/>
               </w:rPr>
-              <w:t>Luther Burden III</w:t>
+              <w:t>DK Metcalf</w:t>
             </w:r>
           </w:p>
           <w:p>
@@ -10813,59 +10813,59 @@
                 <w:color w:val="657589"/>
                 <w:sz w:val="16"/>
               </w:rPr>
-              <w:t>1.6 rush att · 4 rush yds · 0.01 rush TD · 5.5 tgt · 3.7 rec · 44 rec yds · 0.11 rec TD</w:t>
-            </w:r>
-          </w:p>
-        </w:tc>
-        <w:tc>
-          <w:tcPr>
-            <w:tcW w:type="dxa" w:w="893"/>
-            <w:vAlign w:val="center"/>
-          </w:tcPr>
-          <w:p>
-            <w:pPr>
-              <w:jc w:val="right"/>
-            </w:pPr>
-            <w:r>
-              <w:rPr>
-                <w:sz w:val="18"/>
-              </w:rPr>
-              <w:t>5.50</w:t>
-            </w:r>
-          </w:p>
-        </w:tc>
-        <w:tc>
-          <w:tcPr>
-            <w:tcW w:type="dxa" w:w="893"/>
-            <w:vAlign w:val="center"/>
-          </w:tcPr>
-          <w:p>
-            <w:pPr>
-              <w:jc w:val="right"/>
-            </w:pPr>
-            <w:r>
-              <w:rPr>
-                <w:sz w:val="18"/>
-              </w:rPr>
-              <w:t>7.33</w:t>
-            </w:r>
-          </w:p>
-        </w:tc>
-        <w:tc>
-          <w:tcPr>
-            <w:tcW w:type="dxa" w:w="893"/>
-            <w:vAlign w:val="center"/>
-          </w:tcPr>
-          <w:p>
-            <w:pPr>
-              <w:jc w:val="right"/>
-            </w:pPr>
-            <w:r>
-              <w:rPr>
-                <w:b/>
-                <w:sz w:val="18"/>
-              </w:rPr>
-              <w:t>9.16</w:t>
+              <w:t>0.3 rush att · 2 rush yds · 0.00 rush TD · 6.4 tgt · 3.7 rec · 44 rec yds · 0.14 rec TD</w:t>
+            </w:r>
+          </w:p>
+        </w:tc>
+        <w:tc>
+          <w:tcPr>
+            <w:tcW w:type="dxa" w:w="893"/>
+            <w:vAlign w:val="center"/>
+          </w:tcPr>
+          <w:p>
+            <w:pPr>
+              <w:jc w:val="right"/>
+            </w:pPr>
+            <w:r>
+              <w:rPr>
+                <w:sz w:val="18"/>
+              </w:rPr>
+              <w:t>5.45</w:t>
+            </w:r>
+          </w:p>
+        </w:tc>
+        <w:tc>
+          <w:tcPr>
+            <w:tcW w:type="dxa" w:w="893"/>
+            <w:vAlign w:val="center"/>
+          </w:tcPr>
+          <w:p>
+            <w:pPr>
+              <w:jc w:val="right"/>
+            </w:pPr>
+            <w:r>
+              <w:rPr>
+                <w:sz w:val="18"/>
+              </w:rPr>
+              <w:t>7.31</w:t>
+            </w:r>
+          </w:p>
+        </w:tc>
+        <w:tc>
+          <w:tcPr>
+            <w:tcW w:type="dxa" w:w="893"/>
+            <w:vAlign w:val="center"/>
+          </w:tcPr>
+          <w:p>
+            <w:pPr>
+              <w:jc w:val="right"/>
+            </w:pPr>
+            <w:r>
+              <w:rPr>
+                <w:b/>
+                <w:sz w:val="18"/>
+              </w:rPr>
+              <w:t>9.17</w:t>
             </w:r>
           </w:p>
         </w:tc>
@@ -10886,7 +10886,7 @@
                 <w:b/>
                 <w:sz w:val="20"/>
               </w:rPr>
-              <w:t>Dontayvion Wicks</w:t>
+              <w:t>Luther Burden III</w:t>
             </w:r>
           </w:p>
           <w:p>
@@ -10898,62 +10898,62 @@
                 <w:color w:val="657589"/>
                 <w:sz w:val="16"/>
               </w:rPr>
-              <w:t>0.1 rush att · 0 rush yds · 0.00 rush TD · 6.1 tgt · 3.7 rec · 47 rec yds · 0.09 rec TD</w:t>
-            </w:r>
-          </w:p>
-        </w:tc>
-        <w:tc>
-          <w:tcPr>
-            <w:tcW w:type="dxa" w:w="893"/>
-            <w:vAlign w:val="center"/>
-            <w:shd w:fill="F2F5F8"/>
-          </w:tcPr>
-          <w:p>
-            <w:pPr>
-              <w:jc w:val="right"/>
-            </w:pPr>
-            <w:r>
-              <w:rPr>
-                <w:sz w:val="18"/>
-              </w:rPr>
-              <w:t>5.32</w:t>
-            </w:r>
-          </w:p>
-        </w:tc>
-        <w:tc>
-          <w:tcPr>
-            <w:tcW w:type="dxa" w:w="893"/>
-            <w:vAlign w:val="center"/>
-            <w:shd w:fill="F2F5F8"/>
-          </w:tcPr>
-          <w:p>
-            <w:pPr>
-              <w:jc w:val="right"/>
-            </w:pPr>
-            <w:r>
-              <w:rPr>
-                <w:sz w:val="18"/>
-              </w:rPr>
-              <w:t>7.15</w:t>
-            </w:r>
-          </w:p>
-        </w:tc>
-        <w:tc>
-          <w:tcPr>
-            <w:tcW w:type="dxa" w:w="893"/>
-            <w:vAlign w:val="center"/>
-            <w:shd w:fill="F2F5F8"/>
-          </w:tcPr>
-          <w:p>
-            <w:pPr>
-              <w:jc w:val="right"/>
-            </w:pPr>
-            <w:r>
-              <w:rPr>
-                <w:b/>
-                <w:sz w:val="18"/>
-              </w:rPr>
-              <w:t>8.98</w:t>
+              <w:t>1.6 rush att · 4 rush yds · 0.01 rush TD · 5.5 tgt · 3.7 rec · 44 rec yds · 0.11 rec TD</w:t>
+            </w:r>
+          </w:p>
+        </w:tc>
+        <w:tc>
+          <w:tcPr>
+            <w:tcW w:type="dxa" w:w="893"/>
+            <w:vAlign w:val="center"/>
+            <w:shd w:fill="F2F5F8"/>
+          </w:tcPr>
+          <w:p>
+            <w:pPr>
+              <w:jc w:val="right"/>
+            </w:pPr>
+            <w:r>
+              <w:rPr>
+                <w:sz w:val="18"/>
+              </w:rPr>
+              <w:t>5.50</w:t>
+            </w:r>
+          </w:p>
+        </w:tc>
+        <w:tc>
+          <w:tcPr>
+            <w:tcW w:type="dxa" w:w="893"/>
+            <w:vAlign w:val="center"/>
+            <w:shd w:fill="F2F5F8"/>
+          </w:tcPr>
+          <w:p>
+            <w:pPr>
+              <w:jc w:val="right"/>
+            </w:pPr>
+            <w:r>
+              <w:rPr>
+                <w:sz w:val="18"/>
+              </w:rPr>
+              <w:t>7.33</w:t>
+            </w:r>
+          </w:p>
+        </w:tc>
+        <w:tc>
+          <w:tcPr>
+            <w:tcW w:type="dxa" w:w="893"/>
+            <w:vAlign w:val="center"/>
+            <w:shd w:fill="F2F5F8"/>
+          </w:tcPr>
+          <w:p>
+            <w:pPr>
+              <w:jc w:val="right"/>
+            </w:pPr>
+            <w:r>
+              <w:rPr>
+                <w:b/>
+                <w:sz w:val="18"/>
+              </w:rPr>
+              <w:t>9.16</w:t>
             </w:r>
           </w:p>
         </w:tc>
@@ -10973,7 +10973,7 @@
                 <w:b/>
                 <w:sz w:val="20"/>
               </w:rPr>
-              <w:t>Kendrick Bourne</w:t>
+              <w:t>Dontayvion Wicks</w:t>
             </w:r>
           </w:p>
           <w:p>
@@ -10985,59 +10985,59 @@
                 <w:color w:val="657589"/>
                 <w:sz w:val="16"/>
               </w:rPr>
-              <w:t>0.1 rush att · 0 rush yds · 0.00 rush TD · 5.6 tgt · 4.0 rec · 47 rec yds · 0.03 rec TD</w:t>
-            </w:r>
-          </w:p>
-        </w:tc>
-        <w:tc>
-          <w:tcPr>
-            <w:tcW w:type="dxa" w:w="893"/>
-            <w:vAlign w:val="center"/>
-          </w:tcPr>
-          <w:p>
-            <w:pPr>
-              <w:jc w:val="right"/>
-            </w:pPr>
-            <w:r>
-              <w:rPr>
-                <w:sz w:val="18"/>
-              </w:rPr>
-              <w:t>4.91</w:t>
-            </w:r>
-          </w:p>
-        </w:tc>
-        <w:tc>
-          <w:tcPr>
-            <w:tcW w:type="dxa" w:w="893"/>
-            <w:vAlign w:val="center"/>
-          </w:tcPr>
-          <w:p>
-            <w:pPr>
-              <w:jc w:val="right"/>
-            </w:pPr>
-            <w:r>
-              <w:rPr>
-                <w:sz w:val="18"/>
-              </w:rPr>
-              <w:t>6.92</w:t>
-            </w:r>
-          </w:p>
-        </w:tc>
-        <w:tc>
-          <w:tcPr>
-            <w:tcW w:type="dxa" w:w="893"/>
-            <w:vAlign w:val="center"/>
-          </w:tcPr>
-          <w:p>
-            <w:pPr>
-              <w:jc w:val="right"/>
-            </w:pPr>
-            <w:r>
-              <w:rPr>
-                <w:b/>
-                <w:sz w:val="18"/>
-              </w:rPr>
-              <w:t>8.93</w:t>
+              <w:t>0.1 rush att · 0 rush yds · 0.00 rush TD · 6.1 tgt · 3.7 rec · 47 rec yds · 0.09 rec TD</w:t>
+            </w:r>
+          </w:p>
+        </w:tc>
+        <w:tc>
+          <w:tcPr>
+            <w:tcW w:type="dxa" w:w="893"/>
+            <w:vAlign w:val="center"/>
+          </w:tcPr>
+          <w:p>
+            <w:pPr>
+              <w:jc w:val="right"/>
+            </w:pPr>
+            <w:r>
+              <w:rPr>
+                <w:sz w:val="18"/>
+              </w:rPr>
+              <w:t>5.32</w:t>
+            </w:r>
+          </w:p>
+        </w:tc>
+        <w:tc>
+          <w:tcPr>
+            <w:tcW w:type="dxa" w:w="893"/>
+            <w:vAlign w:val="center"/>
+          </w:tcPr>
+          <w:p>
+            <w:pPr>
+              <w:jc w:val="right"/>
+            </w:pPr>
+            <w:r>
+              <w:rPr>
+                <w:sz w:val="18"/>
+              </w:rPr>
+              <w:t>7.15</w:t>
+            </w:r>
+          </w:p>
+        </w:tc>
+        <w:tc>
+          <w:tcPr>
+            <w:tcW w:type="dxa" w:w="893"/>
+            <w:vAlign w:val="center"/>
+          </w:tcPr>
+          <w:p>
+            <w:pPr>
+              <w:jc w:val="right"/>
+            </w:pPr>
+            <w:r>
+              <w:rPr>
+                <w:b/>
+                <w:sz w:val="18"/>
+              </w:rPr>
+              <w:t>8.98</w:t>
             </w:r>
           </w:p>
         </w:tc>
@@ -11058,7 +11058,7 @@
                 <w:b/>
                 <w:sz w:val="20"/>
               </w:rPr>
-              <w:t>Xavier Worthy</w:t>
+              <w:t>Kendrick Bourne</w:t>
             </w:r>
           </w:p>
           <w:p>
@@ -11070,62 +11070,62 @@
                 <w:color w:val="657589"/>
                 <w:sz w:val="16"/>
               </w:rPr>
-              <w:t>0.3 rush att · 1 rush yds · 0.01 rush TD · 5.6 tgt · 3.5 rec · 43 rec yds · 0.14 rec TD</w:t>
-            </w:r>
-          </w:p>
-        </w:tc>
-        <w:tc>
-          <w:tcPr>
-            <w:tcW w:type="dxa" w:w="893"/>
-            <w:vAlign w:val="center"/>
-            <w:shd w:fill="F2F5F8"/>
-          </w:tcPr>
-          <w:p>
-            <w:pPr>
-              <w:jc w:val="right"/>
-            </w:pPr>
-            <w:r>
-              <w:rPr>
-                <w:sz w:val="18"/>
-              </w:rPr>
-              <w:t>5.23</w:t>
-            </w:r>
-          </w:p>
-        </w:tc>
-        <w:tc>
-          <w:tcPr>
-            <w:tcW w:type="dxa" w:w="893"/>
-            <w:vAlign w:val="center"/>
-            <w:shd w:fill="F2F5F8"/>
-          </w:tcPr>
-          <w:p>
-            <w:pPr>
-              <w:jc w:val="right"/>
-            </w:pPr>
-            <w:r>
-              <w:rPr>
-                <w:sz w:val="18"/>
-              </w:rPr>
-              <w:t>6.96</w:t>
-            </w:r>
-          </w:p>
-        </w:tc>
-        <w:tc>
-          <w:tcPr>
-            <w:tcW w:type="dxa" w:w="893"/>
-            <w:vAlign w:val="center"/>
-            <w:shd w:fill="F2F5F8"/>
-          </w:tcPr>
-          <w:p>
-            <w:pPr>
-              <w:jc w:val="right"/>
-            </w:pPr>
-            <w:r>
-              <w:rPr>
-                <w:b/>
-                <w:sz w:val="18"/>
-              </w:rPr>
-              <w:t>8.68</w:t>
+              <w:t>0.1 rush att · 0 rush yds · 0.00 rush TD · 5.6 tgt · 4.0 rec · 47 rec yds · 0.03 rec TD</w:t>
+            </w:r>
+          </w:p>
+        </w:tc>
+        <w:tc>
+          <w:tcPr>
+            <w:tcW w:type="dxa" w:w="893"/>
+            <w:vAlign w:val="center"/>
+            <w:shd w:fill="F2F5F8"/>
+          </w:tcPr>
+          <w:p>
+            <w:pPr>
+              <w:jc w:val="right"/>
+            </w:pPr>
+            <w:r>
+              <w:rPr>
+                <w:sz w:val="18"/>
+              </w:rPr>
+              <w:t>4.91</w:t>
+            </w:r>
+          </w:p>
+        </w:tc>
+        <w:tc>
+          <w:tcPr>
+            <w:tcW w:type="dxa" w:w="893"/>
+            <w:vAlign w:val="center"/>
+            <w:shd w:fill="F2F5F8"/>
+          </w:tcPr>
+          <w:p>
+            <w:pPr>
+              <w:jc w:val="right"/>
+            </w:pPr>
+            <w:r>
+              <w:rPr>
+                <w:sz w:val="18"/>
+              </w:rPr>
+              <w:t>6.92</w:t>
+            </w:r>
+          </w:p>
+        </w:tc>
+        <w:tc>
+          <w:tcPr>
+            <w:tcW w:type="dxa" w:w="893"/>
+            <w:vAlign w:val="center"/>
+            <w:shd w:fill="F2F5F8"/>
+          </w:tcPr>
+          <w:p>
+            <w:pPr>
+              <w:jc w:val="right"/>
+            </w:pPr>
+            <w:r>
+              <w:rPr>
+                <w:b/>
+                <w:sz w:val="18"/>
+              </w:rPr>
+              <w:t>8.93</w:t>
             </w:r>
           </w:p>
         </w:tc>
@@ -11145,7 +11145,7 @@
                 <w:b/>
                 <w:sz w:val="20"/>
               </w:rPr>
-              <w:t>A.J. Brown</w:t>
+              <w:t>Xavier Worthy</w:t>
             </w:r>
           </w:p>
           <w:p>
@@ -11157,59 +11157,59 @@
                 <w:color w:val="657589"/>
                 <w:sz w:val="16"/>
               </w:rPr>
-              <w:t>0.1 rush att · 0 rush yds · 0.00 rush TD · 6.0 tgt · 4.5 rec · 39 rec yds · 0.03 rec TD</w:t>
-            </w:r>
-          </w:p>
-        </w:tc>
-        <w:tc>
-          <w:tcPr>
-            <w:tcW w:type="dxa" w:w="893"/>
-            <w:vAlign w:val="center"/>
-          </w:tcPr>
-          <w:p>
-            <w:pPr>
-              <w:jc w:val="right"/>
-            </w:pPr>
-            <w:r>
-              <w:rPr>
-                <w:sz w:val="18"/>
-              </w:rPr>
-              <w:t>4.11</w:t>
-            </w:r>
-          </w:p>
-        </w:tc>
-        <w:tc>
-          <w:tcPr>
-            <w:tcW w:type="dxa" w:w="893"/>
-            <w:vAlign w:val="center"/>
-          </w:tcPr>
-          <w:p>
-            <w:pPr>
-              <w:jc w:val="right"/>
-            </w:pPr>
-            <w:r>
-              <w:rPr>
-                <w:sz w:val="18"/>
-              </w:rPr>
-              <w:t>6.36</w:t>
-            </w:r>
-          </w:p>
-        </w:tc>
-        <w:tc>
-          <w:tcPr>
-            <w:tcW w:type="dxa" w:w="893"/>
-            <w:vAlign w:val="center"/>
-          </w:tcPr>
-          <w:p>
-            <w:pPr>
-              <w:jc w:val="right"/>
-            </w:pPr>
-            <w:r>
-              <w:rPr>
-                <w:b/>
-                <w:sz w:val="18"/>
-              </w:rPr>
-              <w:t>8.61</w:t>
+              <w:t>0.3 rush att · 1 rush yds · 0.01 rush TD · 5.6 tgt · 3.5 rec · 43 rec yds · 0.14 rec TD</w:t>
+            </w:r>
+          </w:p>
+        </w:tc>
+        <w:tc>
+          <w:tcPr>
+            <w:tcW w:type="dxa" w:w="893"/>
+            <w:vAlign w:val="center"/>
+          </w:tcPr>
+          <w:p>
+            <w:pPr>
+              <w:jc w:val="right"/>
+            </w:pPr>
+            <w:r>
+              <w:rPr>
+                <w:sz w:val="18"/>
+              </w:rPr>
+              <w:t>5.23</w:t>
+            </w:r>
+          </w:p>
+        </w:tc>
+        <w:tc>
+          <w:tcPr>
+            <w:tcW w:type="dxa" w:w="893"/>
+            <w:vAlign w:val="center"/>
+          </w:tcPr>
+          <w:p>
+            <w:pPr>
+              <w:jc w:val="right"/>
+            </w:pPr>
+            <w:r>
+              <w:rPr>
+                <w:sz w:val="18"/>
+              </w:rPr>
+              <w:t>6.96</w:t>
+            </w:r>
+          </w:p>
+        </w:tc>
+        <w:tc>
+          <w:tcPr>
+            <w:tcW w:type="dxa" w:w="893"/>
+            <w:vAlign w:val="center"/>
+          </w:tcPr>
+          <w:p>
+            <w:pPr>
+              <w:jc w:val="right"/>
+            </w:pPr>
+            <w:r>
+              <w:rPr>
+                <w:b/>
+                <w:sz w:val="18"/>
+              </w:rPr>
+              <w:t>8.68</w:t>
             </w:r>
           </w:p>
         </w:tc>
@@ -11230,7 +11230,7 @@
                 <w:b/>
                 <w:sz w:val="20"/>
               </w:rPr>
-              <w:t>Tre Tucker</w:t>
+              <w:t>A.J. Brown</w:t>
             </w:r>
           </w:p>
           <w:p>
@@ -11242,62 +11242,62 @@
                 <w:color w:val="657589"/>
                 <w:sz w:val="16"/>
               </w:rPr>
-              <w:t>0.5 rush att · 1 rush yds · 0.00 rush TD · 5.3 tgt · 3.6 rec · 43 rec yds · 0.07 rec TD</w:t>
-            </w:r>
-          </w:p>
-        </w:tc>
-        <w:tc>
-          <w:tcPr>
-            <w:tcW w:type="dxa" w:w="893"/>
-            <w:vAlign w:val="center"/>
-            <w:shd w:fill="F2F5F8"/>
-          </w:tcPr>
-          <w:p>
-            <w:pPr>
-              <w:jc w:val="right"/>
-            </w:pPr>
-            <w:r>
-              <w:rPr>
-                <w:sz w:val="18"/>
-              </w:rPr>
-              <w:t>4.91</w:t>
-            </w:r>
-          </w:p>
-        </w:tc>
-        <w:tc>
-          <w:tcPr>
-            <w:tcW w:type="dxa" w:w="893"/>
-            <w:vAlign w:val="center"/>
-            <w:shd w:fill="F2F5F8"/>
-          </w:tcPr>
-          <w:p>
-            <w:pPr>
-              <w:jc w:val="right"/>
-            </w:pPr>
-            <w:r>
-              <w:rPr>
-                <w:sz w:val="18"/>
-              </w:rPr>
-              <w:t>6.72</w:t>
-            </w:r>
-          </w:p>
-        </w:tc>
-        <w:tc>
-          <w:tcPr>
-            <w:tcW w:type="dxa" w:w="893"/>
-            <w:vAlign w:val="center"/>
-            <w:shd w:fill="F2F5F8"/>
-          </w:tcPr>
-          <w:p>
-            <w:pPr>
-              <w:jc w:val="right"/>
-            </w:pPr>
-            <w:r>
-              <w:rPr>
-                <w:b/>
-                <w:sz w:val="18"/>
-              </w:rPr>
-              <w:t>8.54</w:t>
+              <w:t>0.1 rush att · 0 rush yds · 0.00 rush TD · 6.0 tgt · 4.5 rec · 39 rec yds · 0.03 rec TD</w:t>
+            </w:r>
+          </w:p>
+        </w:tc>
+        <w:tc>
+          <w:tcPr>
+            <w:tcW w:type="dxa" w:w="893"/>
+            <w:vAlign w:val="center"/>
+            <w:shd w:fill="F2F5F8"/>
+          </w:tcPr>
+          <w:p>
+            <w:pPr>
+              <w:jc w:val="right"/>
+            </w:pPr>
+            <w:r>
+              <w:rPr>
+                <w:sz w:val="18"/>
+              </w:rPr>
+              <w:t>4.11</w:t>
+            </w:r>
+          </w:p>
+        </w:tc>
+        <w:tc>
+          <w:tcPr>
+            <w:tcW w:type="dxa" w:w="893"/>
+            <w:vAlign w:val="center"/>
+            <w:shd w:fill="F2F5F8"/>
+          </w:tcPr>
+          <w:p>
+            <w:pPr>
+              <w:jc w:val="right"/>
+            </w:pPr>
+            <w:r>
+              <w:rPr>
+                <w:sz w:val="18"/>
+              </w:rPr>
+              <w:t>6.36</w:t>
+            </w:r>
+          </w:p>
+        </w:tc>
+        <w:tc>
+          <w:tcPr>
+            <w:tcW w:type="dxa" w:w="893"/>
+            <w:vAlign w:val="center"/>
+            <w:shd w:fill="F2F5F8"/>
+          </w:tcPr>
+          <w:p>
+            <w:pPr>
+              <w:jc w:val="right"/>
+            </w:pPr>
+            <w:r>
+              <w:rPr>
+                <w:b/>
+                <w:sz w:val="18"/>
+              </w:rPr>
+              <w:t>8.61</w:t>
             </w:r>
           </w:p>
         </w:tc>
@@ -11317,7 +11317,7 @@
                 <w:b/>
                 <w:sz w:val="20"/>
               </w:rPr>
-              <w:t>Germie Bernard</w:t>
+              <w:t>Efton Chism III</w:t>
             </w:r>
           </w:p>
           <w:p>
@@ -11329,59 +11329,59 @@
                 <w:color w:val="657589"/>
                 <w:sz w:val="16"/>
               </w:rPr>
-              <w:t>0.3 rush att · 1 rush yds · 0.00 rush TD · 5.3 tgt · 3.5 rec · 41 rec yds · 0.03 rec TD</w:t>
-            </w:r>
-          </w:p>
-        </w:tc>
-        <w:tc>
-          <w:tcPr>
-            <w:tcW w:type="dxa" w:w="893"/>
-            <w:vAlign w:val="center"/>
-          </w:tcPr>
-          <w:p>
-            <w:pPr>
-              <w:jc w:val="right"/>
-            </w:pPr>
-            <w:r>
-              <w:rPr>
-                <w:sz w:val="18"/>
-              </w:rPr>
-              <w:t>4.34</w:t>
-            </w:r>
-          </w:p>
-        </w:tc>
-        <w:tc>
-          <w:tcPr>
-            <w:tcW w:type="dxa" w:w="893"/>
-            <w:vAlign w:val="center"/>
-          </w:tcPr>
-          <w:p>
-            <w:pPr>
-              <w:jc w:val="right"/>
-            </w:pPr>
-            <w:r>
-              <w:rPr>
-                <w:sz w:val="18"/>
-              </w:rPr>
-              <w:t>6.11</w:t>
-            </w:r>
-          </w:p>
-        </w:tc>
-        <w:tc>
-          <w:tcPr>
-            <w:tcW w:type="dxa" w:w="893"/>
-            <w:vAlign w:val="center"/>
-          </w:tcPr>
-          <w:p>
-            <w:pPr>
-              <w:jc w:val="right"/>
-            </w:pPr>
-            <w:r>
-              <w:rPr>
-                <w:b/>
-                <w:sz w:val="18"/>
-              </w:rPr>
-              <w:t>7.87</w:t>
+              <w:t>0.2 rush att · 1 rush yds · 0.00 rush TD · 4.3 tgt · 3.2 rec · 38 rec yds · 0.26 rec TD</w:t>
+            </w:r>
+          </w:p>
+        </w:tc>
+        <w:tc>
+          <w:tcPr>
+            <w:tcW w:type="dxa" w:w="893"/>
+            <w:vAlign w:val="center"/>
+          </w:tcPr>
+          <w:p>
+            <w:pPr>
+              <w:jc w:val="right"/>
+            </w:pPr>
+            <w:r>
+              <w:rPr>
+                <w:sz w:val="18"/>
+              </w:rPr>
+              <w:t>5.37</w:t>
+            </w:r>
+          </w:p>
+        </w:tc>
+        <w:tc>
+          <w:tcPr>
+            <w:tcW w:type="dxa" w:w="893"/>
+            <w:vAlign w:val="center"/>
+          </w:tcPr>
+          <w:p>
+            <w:pPr>
+              <w:jc w:val="right"/>
+            </w:pPr>
+            <w:r>
+              <w:rPr>
+                <w:sz w:val="18"/>
+              </w:rPr>
+              <w:t>6.97</w:t>
+            </w:r>
+          </w:p>
+        </w:tc>
+        <w:tc>
+          <w:tcPr>
+            <w:tcW w:type="dxa" w:w="893"/>
+            <w:vAlign w:val="center"/>
+          </w:tcPr>
+          <w:p>
+            <w:pPr>
+              <w:jc w:val="right"/>
+            </w:pPr>
+            <w:r>
+              <w:rPr>
+                <w:b/>
+                <w:sz w:val="18"/>
+              </w:rPr>
+              <w:t>8.57</w:t>
             </w:r>
           </w:p>
         </w:tc>
@@ -11402,7 +11402,7 @@
                 <w:b/>
                 <w:sz w:val="20"/>
               </w:rPr>
-              <w:t>Kyle Williams</w:t>
+              <w:t>Tre Tucker</w:t>
             </w:r>
           </w:p>
           <w:p>
@@ -11414,62 +11414,62 @@
                 <w:color w:val="657589"/>
                 <w:sz w:val="16"/>
               </w:rPr>
-              <w:t>0.1 rush att · 0 rush yds · 0.00 rush TD · 2.6 tgt · 1.7 rec · 37 rec yds · 0.40 rec TD</w:t>
-            </w:r>
-          </w:p>
-        </w:tc>
-        <w:tc>
-          <w:tcPr>
-            <w:tcW w:type="dxa" w:w="893"/>
-            <w:vAlign w:val="center"/>
-            <w:shd w:fill="F2F5F8"/>
-          </w:tcPr>
-          <w:p>
-            <w:pPr>
-              <w:jc w:val="right"/>
-            </w:pPr>
-            <w:r>
-              <w:rPr>
-                <w:sz w:val="18"/>
-              </w:rPr>
-              <w:t>6.11</w:t>
-            </w:r>
-          </w:p>
-        </w:tc>
-        <w:tc>
-          <w:tcPr>
-            <w:tcW w:type="dxa" w:w="893"/>
-            <w:vAlign w:val="center"/>
-            <w:shd w:fill="F2F5F8"/>
-          </w:tcPr>
-          <w:p>
-            <w:pPr>
-              <w:jc w:val="right"/>
-            </w:pPr>
-            <w:r>
-              <w:rPr>
-                <w:sz w:val="18"/>
-              </w:rPr>
-              <w:t>6.96</w:t>
-            </w:r>
-          </w:p>
-        </w:tc>
-        <w:tc>
-          <w:tcPr>
-            <w:tcW w:type="dxa" w:w="893"/>
-            <w:vAlign w:val="center"/>
-            <w:shd w:fill="F2F5F8"/>
-          </w:tcPr>
-          <w:p>
-            <w:pPr>
-              <w:jc w:val="right"/>
-            </w:pPr>
-            <w:r>
-              <w:rPr>
-                <w:b/>
-                <w:sz w:val="18"/>
-              </w:rPr>
-              <w:t>7.82</w:t>
+              <w:t>0.5 rush att · 1 rush yds · 0.00 rush TD · 5.3 tgt · 3.6 rec · 43 rec yds · 0.07 rec TD</w:t>
+            </w:r>
+          </w:p>
+        </w:tc>
+        <w:tc>
+          <w:tcPr>
+            <w:tcW w:type="dxa" w:w="893"/>
+            <w:vAlign w:val="center"/>
+            <w:shd w:fill="F2F5F8"/>
+          </w:tcPr>
+          <w:p>
+            <w:pPr>
+              <w:jc w:val="right"/>
+            </w:pPr>
+            <w:r>
+              <w:rPr>
+                <w:sz w:val="18"/>
+              </w:rPr>
+              <w:t>4.91</w:t>
+            </w:r>
+          </w:p>
+        </w:tc>
+        <w:tc>
+          <w:tcPr>
+            <w:tcW w:type="dxa" w:w="893"/>
+            <w:vAlign w:val="center"/>
+            <w:shd w:fill="F2F5F8"/>
+          </w:tcPr>
+          <w:p>
+            <w:pPr>
+              <w:jc w:val="right"/>
+            </w:pPr>
+            <w:r>
+              <w:rPr>
+                <w:sz w:val="18"/>
+              </w:rPr>
+              <w:t>6.72</w:t>
+            </w:r>
+          </w:p>
+        </w:tc>
+        <w:tc>
+          <w:tcPr>
+            <w:tcW w:type="dxa" w:w="893"/>
+            <w:vAlign w:val="center"/>
+            <w:shd w:fill="F2F5F8"/>
+          </w:tcPr>
+          <w:p>
+            <w:pPr>
+              <w:jc w:val="right"/>
+            </w:pPr>
+            <w:r>
+              <w:rPr>
+                <w:b/>
+                <w:sz w:val="18"/>
+              </w:rPr>
+              <w:t>8.54</w:t>
             </w:r>
           </w:p>
         </w:tc>
@@ -11489,7 +11489,7 @@
                 <w:b/>
                 <w:sz w:val="20"/>
               </w:rPr>
-              <w:t>Jahan Dotson</w:t>
+              <w:t>Germie Bernard</w:t>
             </w:r>
           </w:p>
           <w:p>
@@ -11501,59 +11501,59 @@
                 <w:color w:val="657589"/>
                 <w:sz w:val="16"/>
               </w:rPr>
-              <w:t>0.1 rush att · 0 rush yds · 0.00 rush TD · 3.5 tgt · 1.7 rec · 41 rec yds · 0.25 rec TD</w:t>
-            </w:r>
-          </w:p>
-        </w:tc>
-        <w:tc>
-          <w:tcPr>
-            <w:tcW w:type="dxa" w:w="893"/>
-            <w:vAlign w:val="center"/>
-          </w:tcPr>
-          <w:p>
-            <w:pPr>
-              <w:jc w:val="right"/>
-            </w:pPr>
-            <w:r>
-              <w:rPr>
-                <w:sz w:val="18"/>
-              </w:rPr>
-              <w:t>5.69</w:t>
-            </w:r>
-          </w:p>
-        </w:tc>
-        <w:tc>
-          <w:tcPr>
-            <w:tcW w:type="dxa" w:w="893"/>
-            <w:vAlign w:val="center"/>
-          </w:tcPr>
-          <w:p>
-            <w:pPr>
-              <w:jc w:val="right"/>
-            </w:pPr>
-            <w:r>
-              <w:rPr>
-                <w:sz w:val="18"/>
-              </w:rPr>
-              <w:t>6.55</w:t>
-            </w:r>
-          </w:p>
-        </w:tc>
-        <w:tc>
-          <w:tcPr>
-            <w:tcW w:type="dxa" w:w="893"/>
-            <w:vAlign w:val="center"/>
-          </w:tcPr>
-          <w:p>
-            <w:pPr>
-              <w:jc w:val="right"/>
-            </w:pPr>
-            <w:r>
-              <w:rPr>
-                <w:b/>
-                <w:sz w:val="18"/>
-              </w:rPr>
-              <w:t>7.42</w:t>
+              <w:t>0.3 rush att · 1 rush yds · 0.00 rush TD · 5.3 tgt · 3.5 rec · 41 rec yds · 0.03 rec TD</w:t>
+            </w:r>
+          </w:p>
+        </w:tc>
+        <w:tc>
+          <w:tcPr>
+            <w:tcW w:type="dxa" w:w="893"/>
+            <w:vAlign w:val="center"/>
+          </w:tcPr>
+          <w:p>
+            <w:pPr>
+              <w:jc w:val="right"/>
+            </w:pPr>
+            <w:r>
+              <w:rPr>
+                <w:sz w:val="18"/>
+              </w:rPr>
+              <w:t>4.34</w:t>
+            </w:r>
+          </w:p>
+        </w:tc>
+        <w:tc>
+          <w:tcPr>
+            <w:tcW w:type="dxa" w:w="893"/>
+            <w:vAlign w:val="center"/>
+          </w:tcPr>
+          <w:p>
+            <w:pPr>
+              <w:jc w:val="right"/>
+            </w:pPr>
+            <w:r>
+              <w:rPr>
+                <w:sz w:val="18"/>
+              </w:rPr>
+              <w:t>6.11</w:t>
+            </w:r>
+          </w:p>
+        </w:tc>
+        <w:tc>
+          <w:tcPr>
+            <w:tcW w:type="dxa" w:w="893"/>
+            <w:vAlign w:val="center"/>
+          </w:tcPr>
+          <w:p>
+            <w:pPr>
+              <w:jc w:val="right"/>
+            </w:pPr>
+            <w:r>
+              <w:rPr>
+                <w:b/>
+                <w:sz w:val="18"/>
+              </w:rPr>
+              <w:t>7.87</w:t>
             </w:r>
           </w:p>
         </w:tc>
@@ -11574,7 +11574,7 @@
                 <w:b/>
                 <w:sz w:val="20"/>
               </w:rPr>
-              <w:t>Efton Chism III</w:t>
+              <w:t>Jahan Dotson</w:t>
             </w:r>
           </w:p>
           <w:p>
@@ -11586,62 +11586,62 @@
                 <w:color w:val="657589"/>
                 <w:sz w:val="16"/>
               </w:rPr>
-              <w:t>0.2 rush att · 1 rush yds · 0.00 rush TD · 3.6 tgt · 2.7 rec · 32 rec yds · 0.22 rec TD</w:t>
-            </w:r>
-          </w:p>
-        </w:tc>
-        <w:tc>
-          <w:tcPr>
-            <w:tcW w:type="dxa" w:w="893"/>
-            <w:vAlign w:val="center"/>
-            <w:shd w:fill="F2F5F8"/>
-          </w:tcPr>
-          <w:p>
-            <w:pPr>
-              <w:jc w:val="right"/>
-            </w:pPr>
-            <w:r>
-              <w:rPr>
-                <w:sz w:val="18"/>
-              </w:rPr>
-              <w:t>4.53</w:t>
-            </w:r>
-          </w:p>
-        </w:tc>
-        <w:tc>
-          <w:tcPr>
-            <w:tcW w:type="dxa" w:w="893"/>
-            <w:vAlign w:val="center"/>
-            <w:shd w:fill="F2F5F8"/>
-          </w:tcPr>
-          <w:p>
-            <w:pPr>
-              <w:jc w:val="right"/>
-            </w:pPr>
-            <w:r>
-              <w:rPr>
-                <w:sz w:val="18"/>
-              </w:rPr>
-              <w:t>5.87</w:t>
-            </w:r>
-          </w:p>
-        </w:tc>
-        <w:tc>
-          <w:tcPr>
-            <w:tcW w:type="dxa" w:w="893"/>
-            <w:vAlign w:val="center"/>
-            <w:shd w:fill="F2F5F8"/>
-          </w:tcPr>
-          <w:p>
-            <w:pPr>
-              <w:jc w:val="right"/>
-            </w:pPr>
-            <w:r>
-              <w:rPr>
-                <w:b/>
-                <w:sz w:val="18"/>
-              </w:rPr>
-              <w:t>7.21</w:t>
+              <w:t>0.1 rush att · 0 rush yds · 0.00 rush TD · 3.5 tgt · 1.7 rec · 41 rec yds · 0.25 rec TD</w:t>
+            </w:r>
+          </w:p>
+        </w:tc>
+        <w:tc>
+          <w:tcPr>
+            <w:tcW w:type="dxa" w:w="893"/>
+            <w:vAlign w:val="center"/>
+            <w:shd w:fill="F2F5F8"/>
+          </w:tcPr>
+          <w:p>
+            <w:pPr>
+              <w:jc w:val="right"/>
+            </w:pPr>
+            <w:r>
+              <w:rPr>
+                <w:sz w:val="18"/>
+              </w:rPr>
+              <w:t>5.69</w:t>
+            </w:r>
+          </w:p>
+        </w:tc>
+        <w:tc>
+          <w:tcPr>
+            <w:tcW w:type="dxa" w:w="893"/>
+            <w:vAlign w:val="center"/>
+            <w:shd w:fill="F2F5F8"/>
+          </w:tcPr>
+          <w:p>
+            <w:pPr>
+              <w:jc w:val="right"/>
+            </w:pPr>
+            <w:r>
+              <w:rPr>
+                <w:sz w:val="18"/>
+              </w:rPr>
+              <w:t>6.55</w:t>
+            </w:r>
+          </w:p>
+        </w:tc>
+        <w:tc>
+          <w:tcPr>
+            <w:tcW w:type="dxa" w:w="893"/>
+            <w:vAlign w:val="center"/>
+            <w:shd w:fill="F2F5F8"/>
+          </w:tcPr>
+          <w:p>
+            <w:pPr>
+              <w:jc w:val="right"/>
+            </w:pPr>
+            <w:r>
+              <w:rPr>
+                <w:b/>
+                <w:sz w:val="18"/>
+              </w:rPr>
+              <w:t>7.42</w:t>
             </w:r>
           </w:p>
         </w:tc>
@@ -18031,7 +18031,7 @@
                 <w:b/>
                 <w:sz w:val="20"/>
               </w:rPr>
-              <w:t>Pat Freiermuth</w:t>
+              <w:t>Hunter Henry</w:t>
             </w:r>
           </w:p>
           <w:p>
@@ -18043,62 +18043,62 @@
                 <w:color w:val="657589"/>
                 <w:sz w:val="16"/>
               </w:rPr>
-              <w:t>0.4 rush att · 1 rush yds · 0.00 rush TD · 5.3 tgt · 3.7 rec · 32 rec yds · 0.80 rec TD</w:t>
-            </w:r>
-          </w:p>
-        </w:tc>
-        <w:tc>
-          <w:tcPr>
-            <w:tcW w:type="dxa" w:w="893"/>
-            <w:vAlign w:val="center"/>
-            <w:shd w:fill="F2F5F8"/>
-          </w:tcPr>
-          <w:p>
-            <w:pPr>
-              <w:jc w:val="right"/>
-            </w:pPr>
-            <w:r>
-              <w:rPr>
-                <w:sz w:val="18"/>
-              </w:rPr>
-              <w:t>8.11</w:t>
-            </w:r>
-          </w:p>
-        </w:tc>
-        <w:tc>
-          <w:tcPr>
-            <w:tcW w:type="dxa" w:w="893"/>
-            <w:vAlign w:val="center"/>
-            <w:shd w:fill="F2F5F8"/>
-          </w:tcPr>
-          <w:p>
-            <w:pPr>
-              <w:jc w:val="right"/>
-            </w:pPr>
-            <w:r>
-              <w:rPr>
-                <w:sz w:val="18"/>
-              </w:rPr>
-              <w:t>9.98</w:t>
-            </w:r>
-          </w:p>
-        </w:tc>
-        <w:tc>
-          <w:tcPr>
-            <w:tcW w:type="dxa" w:w="893"/>
-            <w:vAlign w:val="center"/>
-            <w:shd w:fill="F2F5F8"/>
-          </w:tcPr>
-          <w:p>
-            <w:pPr>
-              <w:jc w:val="right"/>
-            </w:pPr>
-            <w:r>
-              <w:rPr>
-                <w:b/>
-                <w:sz w:val="18"/>
-              </w:rPr>
-              <w:t>11.85</w:t>
+              <w:t>0.0 rush att · 0 rush yds · 0.00 rush TD · 4.8 tgt · 3.9 rec · 50 rec yds · 0.54 rec TD</w:t>
+            </w:r>
+          </w:p>
+        </w:tc>
+        <w:tc>
+          <w:tcPr>
+            <w:tcW w:type="dxa" w:w="893"/>
+            <w:vAlign w:val="center"/>
+            <w:shd w:fill="F2F5F8"/>
+          </w:tcPr>
+          <w:p>
+            <w:pPr>
+              <w:jc w:val="right"/>
+            </w:pPr>
+            <w:r>
+              <w:rPr>
+                <w:sz w:val="18"/>
+              </w:rPr>
+              <w:t>8.19</w:t>
+            </w:r>
+          </w:p>
+        </w:tc>
+        <w:tc>
+          <w:tcPr>
+            <w:tcW w:type="dxa" w:w="893"/>
+            <w:vAlign w:val="center"/>
+            <w:shd w:fill="F2F5F8"/>
+          </w:tcPr>
+          <w:p>
+            <w:pPr>
+              <w:jc w:val="right"/>
+            </w:pPr>
+            <w:r>
+              <w:rPr>
+                <w:sz w:val="18"/>
+              </w:rPr>
+              <w:t>10.14</w:t>
+            </w:r>
+          </w:p>
+        </w:tc>
+        <w:tc>
+          <w:tcPr>
+            <w:tcW w:type="dxa" w:w="893"/>
+            <w:vAlign w:val="center"/>
+            <w:shd w:fill="F2F5F8"/>
+          </w:tcPr>
+          <w:p>
+            <w:pPr>
+              <w:jc w:val="right"/>
+            </w:pPr>
+            <w:r>
+              <w:rPr>
+                <w:b/>
+                <w:sz w:val="18"/>
+              </w:rPr>
+              <w:t>12.09</w:t>
             </w:r>
           </w:p>
         </w:tc>
@@ -18118,7 +18118,7 @@
                 <w:b/>
                 <w:sz w:val="20"/>
               </w:rPr>
-              <w:t>Brenton Strange</w:t>
+              <w:t>Pat Freiermuth</w:t>
             </w:r>
           </w:p>
           <w:p>
@@ -18130,59 +18130,59 @@
                 <w:color w:val="657589"/>
                 <w:sz w:val="16"/>
               </w:rPr>
-              <w:t>0.0 rush att · 0 rush yds · 0.00 rush TD · 6.4 tgt · 5.4 rec · 59 rec yds · 0.09 rec TD</w:t>
-            </w:r>
-          </w:p>
-        </w:tc>
-        <w:tc>
-          <w:tcPr>
-            <w:tcW w:type="dxa" w:w="893"/>
-            <w:vAlign w:val="center"/>
-          </w:tcPr>
-          <w:p>
-            <w:pPr>
-              <w:jc w:val="right"/>
-            </w:pPr>
-            <w:r>
-              <w:rPr>
-                <w:sz w:val="18"/>
-              </w:rPr>
-              <w:t>6.41</w:t>
-            </w:r>
-          </w:p>
-        </w:tc>
-        <w:tc>
-          <w:tcPr>
-            <w:tcW w:type="dxa" w:w="893"/>
-            <w:vAlign w:val="center"/>
-          </w:tcPr>
-          <w:p>
-            <w:pPr>
-              <w:jc w:val="right"/>
-            </w:pPr>
-            <w:r>
-              <w:rPr>
-                <w:sz w:val="18"/>
-              </w:rPr>
-              <w:t>9.10</w:t>
-            </w:r>
-          </w:p>
-        </w:tc>
-        <w:tc>
-          <w:tcPr>
-            <w:tcW w:type="dxa" w:w="893"/>
-            <w:vAlign w:val="center"/>
-          </w:tcPr>
-          <w:p>
-            <w:pPr>
-              <w:jc w:val="right"/>
-            </w:pPr>
-            <w:r>
-              <w:rPr>
-                <w:b/>
-                <w:sz w:val="18"/>
-              </w:rPr>
-              <w:t>11.79</w:t>
+              <w:t>0.4 rush att · 1 rush yds · 0.00 rush TD · 5.3 tgt · 3.7 rec · 32 rec yds · 0.80 rec TD</w:t>
+            </w:r>
+          </w:p>
+        </w:tc>
+        <w:tc>
+          <w:tcPr>
+            <w:tcW w:type="dxa" w:w="893"/>
+            <w:vAlign w:val="center"/>
+          </w:tcPr>
+          <w:p>
+            <w:pPr>
+              <w:jc w:val="right"/>
+            </w:pPr>
+            <w:r>
+              <w:rPr>
+                <w:sz w:val="18"/>
+              </w:rPr>
+              <w:t>8.11</w:t>
+            </w:r>
+          </w:p>
+        </w:tc>
+        <w:tc>
+          <w:tcPr>
+            <w:tcW w:type="dxa" w:w="893"/>
+            <w:vAlign w:val="center"/>
+          </w:tcPr>
+          <w:p>
+            <w:pPr>
+              <w:jc w:val="right"/>
+            </w:pPr>
+            <w:r>
+              <w:rPr>
+                <w:sz w:val="18"/>
+              </w:rPr>
+              <w:t>9.98</w:t>
+            </w:r>
+          </w:p>
+        </w:tc>
+        <w:tc>
+          <w:tcPr>
+            <w:tcW w:type="dxa" w:w="893"/>
+            <w:vAlign w:val="center"/>
+          </w:tcPr>
+          <w:p>
+            <w:pPr>
+              <w:jc w:val="right"/>
+            </w:pPr>
+            <w:r>
+              <w:rPr>
+                <w:b/>
+                <w:sz w:val="18"/>
+              </w:rPr>
+              <w:t>11.85</w:t>
             </w:r>
           </w:p>
         </w:tc>
@@ -18203,7 +18203,7 @@
                 <w:b/>
                 <w:sz w:val="20"/>
               </w:rPr>
-              <w:t>Tyler Higbee</w:t>
+              <w:t>Brenton Strange</w:t>
             </w:r>
           </w:p>
           <w:p>
@@ -18215,62 +18215,62 @@
                 <w:color w:val="657589"/>
                 <w:sz w:val="16"/>
               </w:rPr>
-              <w:t>0.0 rush att · 0 rush yds · 0.00 rush TD · 5.8 tgt · 4.7 rec · 62 rec yds · 0.13 rec TD</w:t>
-            </w:r>
-          </w:p>
-        </w:tc>
-        <w:tc>
-          <w:tcPr>
-            <w:tcW w:type="dxa" w:w="893"/>
-            <w:vAlign w:val="center"/>
-            <w:shd w:fill="F2F5F8"/>
-          </w:tcPr>
-          <w:p>
-            <w:pPr>
-              <w:jc w:val="right"/>
-            </w:pPr>
-            <w:r>
-              <w:rPr>
-                <w:sz w:val="18"/>
-              </w:rPr>
-              <w:t>7.04</w:t>
-            </w:r>
-          </w:p>
-        </w:tc>
-        <w:tc>
-          <w:tcPr>
-            <w:tcW w:type="dxa" w:w="893"/>
-            <w:vAlign w:val="center"/>
-            <w:shd w:fill="F2F5F8"/>
-          </w:tcPr>
-          <w:p>
-            <w:pPr>
-              <w:jc w:val="right"/>
-            </w:pPr>
-            <w:r>
-              <w:rPr>
-                <w:sz w:val="18"/>
-              </w:rPr>
-              <w:t>9.39</w:t>
-            </w:r>
-          </w:p>
-        </w:tc>
-        <w:tc>
-          <w:tcPr>
-            <w:tcW w:type="dxa" w:w="893"/>
-            <w:vAlign w:val="center"/>
-            <w:shd w:fill="F2F5F8"/>
-          </w:tcPr>
-          <w:p>
-            <w:pPr>
-              <w:jc w:val="right"/>
-            </w:pPr>
-            <w:r>
-              <w:rPr>
-                <w:b/>
-                <w:sz w:val="18"/>
-              </w:rPr>
-              <w:t>11.74</w:t>
+              <w:t>0.0 rush att · 0 rush yds · 0.00 rush TD · 6.4 tgt · 5.4 rec · 59 rec yds · 0.09 rec TD</w:t>
+            </w:r>
+          </w:p>
+        </w:tc>
+        <w:tc>
+          <w:tcPr>
+            <w:tcW w:type="dxa" w:w="893"/>
+            <w:vAlign w:val="center"/>
+            <w:shd w:fill="F2F5F8"/>
+          </w:tcPr>
+          <w:p>
+            <w:pPr>
+              <w:jc w:val="right"/>
+            </w:pPr>
+            <w:r>
+              <w:rPr>
+                <w:sz w:val="18"/>
+              </w:rPr>
+              <w:t>6.41</w:t>
+            </w:r>
+          </w:p>
+        </w:tc>
+        <w:tc>
+          <w:tcPr>
+            <w:tcW w:type="dxa" w:w="893"/>
+            <w:vAlign w:val="center"/>
+            <w:shd w:fill="F2F5F8"/>
+          </w:tcPr>
+          <w:p>
+            <w:pPr>
+              <w:jc w:val="right"/>
+            </w:pPr>
+            <w:r>
+              <w:rPr>
+                <w:sz w:val="18"/>
+              </w:rPr>
+              <w:t>9.10</w:t>
+            </w:r>
+          </w:p>
+        </w:tc>
+        <w:tc>
+          <w:tcPr>
+            <w:tcW w:type="dxa" w:w="893"/>
+            <w:vAlign w:val="center"/>
+            <w:shd w:fill="F2F5F8"/>
+          </w:tcPr>
+          <w:p>
+            <w:pPr>
+              <w:jc w:val="right"/>
+            </w:pPr>
+            <w:r>
+              <w:rPr>
+                <w:b/>
+                <w:sz w:val="18"/>
+              </w:rPr>
+              <w:t>11.79</w:t>
             </w:r>
           </w:p>
         </w:tc>
@@ -18290,7 +18290,7 @@
                 <w:b/>
                 <w:sz w:val="20"/>
               </w:rPr>
-              <w:t>Tucker Kraft</w:t>
+              <w:t>Tyler Higbee</w:t>
             </w:r>
           </w:p>
           <w:p>
@@ -18302,59 +18302,59 @@
                 <w:color w:val="657589"/>
                 <w:sz w:val="16"/>
               </w:rPr>
-              <w:t>0.3 rush att · 1 rush yds · 0.00 rush TD · 5.7 tgt · 4.6 rec · 49 rec yds · 0.24 rec TD</w:t>
-            </w:r>
-          </w:p>
-        </w:tc>
-        <w:tc>
-          <w:tcPr>
-            <w:tcW w:type="dxa" w:w="893"/>
-            <w:vAlign w:val="center"/>
-          </w:tcPr>
-          <w:p>
-            <w:pPr>
-              <w:jc w:val="right"/>
-            </w:pPr>
-            <w:r>
-              <w:rPr>
-                <w:sz w:val="18"/>
-              </w:rPr>
-              <w:t>6.38</w:t>
-            </w:r>
-          </w:p>
-        </w:tc>
-        <w:tc>
-          <w:tcPr>
-            <w:tcW w:type="dxa" w:w="893"/>
-            <w:vAlign w:val="center"/>
-          </w:tcPr>
-          <w:p>
-            <w:pPr>
-              <w:jc w:val="right"/>
-            </w:pPr>
-            <w:r>
-              <w:rPr>
-                <w:sz w:val="18"/>
-              </w:rPr>
-              <w:t>8.66</w:t>
-            </w:r>
-          </w:p>
-        </w:tc>
-        <w:tc>
-          <w:tcPr>
-            <w:tcW w:type="dxa" w:w="893"/>
-            <w:vAlign w:val="center"/>
-          </w:tcPr>
-          <w:p>
-            <w:pPr>
-              <w:jc w:val="right"/>
-            </w:pPr>
-            <w:r>
-              <w:rPr>
-                <w:b/>
-                <w:sz w:val="18"/>
-              </w:rPr>
-              <w:t>10.95</w:t>
+              <w:t>0.0 rush att · 0 rush yds · 0.00 rush TD · 5.8 tgt · 4.7 rec · 62 rec yds · 0.13 rec TD</w:t>
+            </w:r>
+          </w:p>
+        </w:tc>
+        <w:tc>
+          <w:tcPr>
+            <w:tcW w:type="dxa" w:w="893"/>
+            <w:vAlign w:val="center"/>
+          </w:tcPr>
+          <w:p>
+            <w:pPr>
+              <w:jc w:val="right"/>
+            </w:pPr>
+            <w:r>
+              <w:rPr>
+                <w:sz w:val="18"/>
+              </w:rPr>
+              <w:t>7.04</w:t>
+            </w:r>
+          </w:p>
+        </w:tc>
+        <w:tc>
+          <w:tcPr>
+            <w:tcW w:type="dxa" w:w="893"/>
+            <w:vAlign w:val="center"/>
+          </w:tcPr>
+          <w:p>
+            <w:pPr>
+              <w:jc w:val="right"/>
+            </w:pPr>
+            <w:r>
+              <w:rPr>
+                <w:sz w:val="18"/>
+              </w:rPr>
+              <w:t>9.39</w:t>
+            </w:r>
+          </w:p>
+        </w:tc>
+        <w:tc>
+          <w:tcPr>
+            <w:tcW w:type="dxa" w:w="893"/>
+            <w:vAlign w:val="center"/>
+          </w:tcPr>
+          <w:p>
+            <w:pPr>
+              <w:jc w:val="right"/>
+            </w:pPr>
+            <w:r>
+              <w:rPr>
+                <w:b/>
+                <w:sz w:val="18"/>
+              </w:rPr>
+              <w:t>11.74</w:t>
             </w:r>
           </w:p>
         </w:tc>
@@ -18375,7 +18375,7 @@
                 <w:b/>
                 <w:sz w:val="20"/>
               </w:rPr>
-              <w:t>Juwan Johnson</w:t>
+              <w:t>Tucker Kraft</w:t>
             </w:r>
           </w:p>
           <w:p>
@@ -18387,62 +18387,62 @@
                 <w:color w:val="657589"/>
                 <w:sz w:val="16"/>
               </w:rPr>
-              <w:t>0.0 rush att · 0 rush yds · 0.00 rush TD · 6.1 tgt · 4.8 rec · 38 rec yds · 0.35 rec TD</w:t>
-            </w:r>
-          </w:p>
-        </w:tc>
-        <w:tc>
-          <w:tcPr>
-            <w:tcW w:type="dxa" w:w="893"/>
-            <w:vAlign w:val="center"/>
-            <w:shd w:fill="F2F5F8"/>
-          </w:tcPr>
-          <w:p>
-            <w:pPr>
-              <w:jc w:val="right"/>
-            </w:pPr>
-            <w:r>
-              <w:rPr>
-                <w:sz w:val="18"/>
-              </w:rPr>
-              <w:t>5.90</w:t>
-            </w:r>
-          </w:p>
-        </w:tc>
-        <w:tc>
-          <w:tcPr>
-            <w:tcW w:type="dxa" w:w="893"/>
-            <w:vAlign w:val="center"/>
-            <w:shd w:fill="F2F5F8"/>
-          </w:tcPr>
-          <w:p>
-            <w:pPr>
-              <w:jc w:val="right"/>
-            </w:pPr>
-            <w:r>
-              <w:rPr>
-                <w:sz w:val="18"/>
-              </w:rPr>
-              <w:t>8.33</w:t>
-            </w:r>
-          </w:p>
-        </w:tc>
-        <w:tc>
-          <w:tcPr>
-            <w:tcW w:type="dxa" w:w="893"/>
-            <w:vAlign w:val="center"/>
-            <w:shd w:fill="F2F5F8"/>
-          </w:tcPr>
-          <w:p>
-            <w:pPr>
-              <w:jc w:val="right"/>
-            </w:pPr>
-            <w:r>
-              <w:rPr>
-                <w:b/>
-                <w:sz w:val="18"/>
-              </w:rPr>
-              <w:t>10.75</w:t>
+              <w:t>0.3 rush att · 1 rush yds · 0.00 rush TD · 5.7 tgt · 4.6 rec · 49 rec yds · 0.24 rec TD</w:t>
+            </w:r>
+          </w:p>
+        </w:tc>
+        <w:tc>
+          <w:tcPr>
+            <w:tcW w:type="dxa" w:w="893"/>
+            <w:vAlign w:val="center"/>
+            <w:shd w:fill="F2F5F8"/>
+          </w:tcPr>
+          <w:p>
+            <w:pPr>
+              <w:jc w:val="right"/>
+            </w:pPr>
+            <w:r>
+              <w:rPr>
+                <w:sz w:val="18"/>
+              </w:rPr>
+              <w:t>6.38</w:t>
+            </w:r>
+          </w:p>
+        </w:tc>
+        <w:tc>
+          <w:tcPr>
+            <w:tcW w:type="dxa" w:w="893"/>
+            <w:vAlign w:val="center"/>
+            <w:shd w:fill="F2F5F8"/>
+          </w:tcPr>
+          <w:p>
+            <w:pPr>
+              <w:jc w:val="right"/>
+            </w:pPr>
+            <w:r>
+              <w:rPr>
+                <w:sz w:val="18"/>
+              </w:rPr>
+              <w:t>8.66</w:t>
+            </w:r>
+          </w:p>
+        </w:tc>
+        <w:tc>
+          <w:tcPr>
+            <w:tcW w:type="dxa" w:w="893"/>
+            <w:vAlign w:val="center"/>
+            <w:shd w:fill="F2F5F8"/>
+          </w:tcPr>
+          <w:p>
+            <w:pPr>
+              <w:jc w:val="right"/>
+            </w:pPr>
+            <w:r>
+              <w:rPr>
+                <w:b/>
+                <w:sz w:val="18"/>
+              </w:rPr>
+              <w:t>10.95</w:t>
             </w:r>
           </w:p>
         </w:tc>
@@ -18462,7 +18462,7 @@
                 <w:b/>
                 <w:sz w:val="20"/>
               </w:rPr>
-              <w:t>Travis Kelce</w:t>
+              <w:t>Juwan Johnson</w:t>
             </w:r>
           </w:p>
           <w:p>
@@ -18474,59 +18474,59 @@
                 <w:color w:val="657589"/>
                 <w:sz w:val="16"/>
               </w:rPr>
-              <w:t>0.0 rush att · 0 rush yds · 0.00 rush TD · 4.7 tgt · 3.1 rec · 47 rec yds · 0.39 rec TD</w:t>
-            </w:r>
-          </w:p>
-        </w:tc>
-        <w:tc>
-          <w:tcPr>
-            <w:tcW w:type="dxa" w:w="893"/>
-            <w:vAlign w:val="center"/>
-          </w:tcPr>
-          <w:p>
-            <w:pPr>
-              <w:jc w:val="right"/>
-            </w:pPr>
-            <w:r>
-              <w:rPr>
-                <w:sz w:val="18"/>
-              </w:rPr>
-              <w:t>7.07</w:t>
-            </w:r>
-          </w:p>
-        </w:tc>
-        <w:tc>
-          <w:tcPr>
-            <w:tcW w:type="dxa" w:w="893"/>
-            <w:vAlign w:val="center"/>
-          </w:tcPr>
-          <w:p>
-            <w:pPr>
-              <w:jc w:val="right"/>
-            </w:pPr>
-            <w:r>
-              <w:rPr>
-                <w:sz w:val="18"/>
-              </w:rPr>
-              <w:t>8.64</w:t>
-            </w:r>
-          </w:p>
-        </w:tc>
-        <w:tc>
-          <w:tcPr>
-            <w:tcW w:type="dxa" w:w="893"/>
-            <w:vAlign w:val="center"/>
-          </w:tcPr>
-          <w:p>
-            <w:pPr>
-              <w:jc w:val="right"/>
-            </w:pPr>
-            <w:r>
-              <w:rPr>
-                <w:b/>
-                <w:sz w:val="18"/>
-              </w:rPr>
-              <w:t>10.21</w:t>
+              <w:t>0.0 rush att · 0 rush yds · 0.00 rush TD · 6.1 tgt · 4.8 rec · 38 rec yds · 0.35 rec TD</w:t>
+            </w:r>
+          </w:p>
+        </w:tc>
+        <w:tc>
+          <w:tcPr>
+            <w:tcW w:type="dxa" w:w="893"/>
+            <w:vAlign w:val="center"/>
+          </w:tcPr>
+          <w:p>
+            <w:pPr>
+              <w:jc w:val="right"/>
+            </w:pPr>
+            <w:r>
+              <w:rPr>
+                <w:sz w:val="18"/>
+              </w:rPr>
+              <w:t>5.90</w:t>
+            </w:r>
+          </w:p>
+        </w:tc>
+        <w:tc>
+          <w:tcPr>
+            <w:tcW w:type="dxa" w:w="893"/>
+            <w:vAlign w:val="center"/>
+          </w:tcPr>
+          <w:p>
+            <w:pPr>
+              <w:jc w:val="right"/>
+            </w:pPr>
+            <w:r>
+              <w:rPr>
+                <w:sz w:val="18"/>
+              </w:rPr>
+              <w:t>8.33</w:t>
+            </w:r>
+          </w:p>
+        </w:tc>
+        <w:tc>
+          <w:tcPr>
+            <w:tcW w:type="dxa" w:w="893"/>
+            <w:vAlign w:val="center"/>
+          </w:tcPr>
+          <w:p>
+            <w:pPr>
+              <w:jc w:val="right"/>
+            </w:pPr>
+            <w:r>
+              <w:rPr>
+                <w:b/>
+                <w:sz w:val="18"/>
+              </w:rPr>
+              <w:t>10.75</w:t>
             </w:r>
           </w:p>
         </w:tc>
@@ -18547,7 +18547,7 @@
                 <w:b/>
                 <w:sz w:val="20"/>
               </w:rPr>
-              <w:t>Hunter Henry</w:t>
+              <w:t>Travis Kelce</w:t>
             </w:r>
           </w:p>
           <w:p>
@@ -18559,62 +18559,62 @@
                 <w:color w:val="657589"/>
                 <w:sz w:val="16"/>
               </w:rPr>
-              <w:t>0.0 rush att · 0 rush yds · 0.00 rush TD · 4.0 tgt · 3.3 rec · 42 rec yds · 0.45 rec TD</w:t>
-            </w:r>
-          </w:p>
-        </w:tc>
-        <w:tc>
-          <w:tcPr>
-            <w:tcW w:type="dxa" w:w="893"/>
-            <w:vAlign w:val="center"/>
-            <w:shd w:fill="F2F5F8"/>
-          </w:tcPr>
-          <w:p>
-            <w:pPr>
-              <w:jc w:val="right"/>
-            </w:pPr>
-            <w:r>
-              <w:rPr>
-                <w:sz w:val="18"/>
-              </w:rPr>
-              <w:t>6.88</w:t>
-            </w:r>
-          </w:p>
-        </w:tc>
-        <w:tc>
-          <w:tcPr>
-            <w:tcW w:type="dxa" w:w="893"/>
-            <w:vAlign w:val="center"/>
-            <w:shd w:fill="F2F5F8"/>
-          </w:tcPr>
-          <w:p>
-            <w:pPr>
-              <w:jc w:val="right"/>
-            </w:pPr>
-            <w:r>
-              <w:rPr>
-                <w:sz w:val="18"/>
-              </w:rPr>
-              <w:t>8.52</w:t>
-            </w:r>
-          </w:p>
-        </w:tc>
-        <w:tc>
-          <w:tcPr>
-            <w:tcW w:type="dxa" w:w="893"/>
-            <w:vAlign w:val="center"/>
-            <w:shd w:fill="F2F5F8"/>
-          </w:tcPr>
-          <w:p>
-            <w:pPr>
-              <w:jc w:val="right"/>
-            </w:pPr>
-            <w:r>
-              <w:rPr>
-                <w:b/>
-                <w:sz w:val="18"/>
-              </w:rPr>
-              <w:t>10.16</w:t>
+              <w:t>0.0 rush att · 0 rush yds · 0.00 rush TD · 4.7 tgt · 3.1 rec · 47 rec yds · 0.39 rec TD</w:t>
+            </w:r>
+          </w:p>
+        </w:tc>
+        <w:tc>
+          <w:tcPr>
+            <w:tcW w:type="dxa" w:w="893"/>
+            <w:vAlign w:val="center"/>
+            <w:shd w:fill="F2F5F8"/>
+          </w:tcPr>
+          <w:p>
+            <w:pPr>
+              <w:jc w:val="right"/>
+            </w:pPr>
+            <w:r>
+              <w:rPr>
+                <w:sz w:val="18"/>
+              </w:rPr>
+              <w:t>7.07</w:t>
+            </w:r>
+          </w:p>
+        </w:tc>
+        <w:tc>
+          <w:tcPr>
+            <w:tcW w:type="dxa" w:w="893"/>
+            <w:vAlign w:val="center"/>
+            <w:shd w:fill="F2F5F8"/>
+          </w:tcPr>
+          <w:p>
+            <w:pPr>
+              <w:jc w:val="right"/>
+            </w:pPr>
+            <w:r>
+              <w:rPr>
+                <w:sz w:val="18"/>
+              </w:rPr>
+              <w:t>8.64</w:t>
+            </w:r>
+          </w:p>
+        </w:tc>
+        <w:tc>
+          <w:tcPr>
+            <w:tcW w:type="dxa" w:w="893"/>
+            <w:vAlign w:val="center"/>
+            <w:shd w:fill="F2F5F8"/>
+          </w:tcPr>
+          <w:p>
+            <w:pPr>
+              <w:jc w:val="right"/>
+            </w:pPr>
+            <w:r>
+              <w:rPr>
+                <w:b/>
+                <w:sz w:val="18"/>
+              </w:rPr>
+              <w:t>10.21</w:t>
             </w:r>
           </w:p>
         </w:tc>
@@ -19923,7 +19923,7 @@
                 <w:b/>
                 <w:sz w:val="20"/>
               </w:rPr>
-              <w:t>Elijah Higgins</w:t>
+              <w:t>Eli Raridon</w:t>
             </w:r>
           </w:p>
           <w:p>
@@ -19935,25 +19935,25 @@
                 <w:color w:val="657589"/>
                 <w:sz w:val="16"/>
               </w:rPr>
-              <w:t>0.0 rush att · 0 rush yds · 0.00 rush TD · 0.4 tgt · 0.3 rec · 5 rec yds · 0.04 rec TD</w:t>
-            </w:r>
-          </w:p>
-        </w:tc>
-        <w:tc>
-          <w:tcPr>
-            <w:tcW w:type="dxa" w:w="893"/>
-            <w:vAlign w:val="center"/>
-            <w:shd w:fill="F2F5F8"/>
-          </w:tcPr>
-          <w:p>
-            <w:pPr>
-              <w:jc w:val="right"/>
-            </w:pPr>
-            <w:r>
-              <w:rPr>
-                <w:sz w:val="18"/>
-              </w:rPr>
-              <w:t>0.76</w:t>
+              <w:t>0.0 rush att · 0 rush yds · 0.00 rush TD · 0.5 tgt · 0.5 rec · 5 rec yds · 0.03 rec TD</w:t>
+            </w:r>
+          </w:p>
+        </w:tc>
+        <w:tc>
+          <w:tcPr>
+            <w:tcW w:type="dxa" w:w="893"/>
+            <w:vAlign w:val="center"/>
+            <w:shd w:fill="F2F5F8"/>
+          </w:tcPr>
+          <w:p>
+            <w:pPr>
+              <w:jc w:val="right"/>
+            </w:pPr>
+            <w:r>
+              <w:rPr>
+                <w:sz w:val="18"/>
+              </w:rPr>
+              <w:t>0.70</w:t>
             </w:r>
           </w:p>
         </w:tc>
@@ -19990,7 +19990,7 @@
                 <w:b/>
                 <w:sz w:val="18"/>
               </w:rPr>
-              <w:t>1.10</w:t>
+              <w:t>1.15</w:t>
             </w:r>
           </w:p>
         </w:tc>
@@ -20010,7 +20010,7 @@
                 <w:b/>
                 <w:sz w:val="20"/>
               </w:rPr>
-              <w:t>Eli Raridon</w:t>
+              <w:t>Elijah Higgins</w:t>
             </w:r>
           </w:p>
           <w:p>
@@ -20022,59 +20022,59 @@
                 <w:color w:val="657589"/>
                 <w:sz w:val="16"/>
               </w:rPr>
-              <w:t>0.0 rush att · 0 rush yds · 0.00 rush TD · 0.4 tgt · 0.4 rec · 5 rec yds · 0.02 rec TD</w:t>
-            </w:r>
-          </w:p>
-        </w:tc>
-        <w:tc>
-          <w:tcPr>
-            <w:tcW w:type="dxa" w:w="893"/>
-            <w:vAlign w:val="center"/>
-          </w:tcPr>
-          <w:p>
-            <w:pPr>
-              <w:jc w:val="right"/>
-            </w:pPr>
-            <w:r>
-              <w:rPr>
-                <w:sz w:val="18"/>
-              </w:rPr>
-              <w:t>0.59</w:t>
-            </w:r>
-          </w:p>
-        </w:tc>
-        <w:tc>
-          <w:tcPr>
-            <w:tcW w:type="dxa" w:w="893"/>
-            <w:vAlign w:val="center"/>
-          </w:tcPr>
-          <w:p>
-            <w:pPr>
-              <w:jc w:val="right"/>
-            </w:pPr>
-            <w:r>
-              <w:rPr>
-                <w:sz w:val="18"/>
-              </w:rPr>
-              <w:t>0.78</w:t>
-            </w:r>
-          </w:p>
-        </w:tc>
-        <w:tc>
-          <w:tcPr>
-            <w:tcW w:type="dxa" w:w="893"/>
-            <w:vAlign w:val="center"/>
-          </w:tcPr>
-          <w:p>
-            <w:pPr>
-              <w:jc w:val="right"/>
-            </w:pPr>
-            <w:r>
-              <w:rPr>
-                <w:b/>
-                <w:sz w:val="18"/>
-              </w:rPr>
-              <w:t>0.97</w:t>
+              <w:t>0.0 rush att · 0 rush yds · 0.00 rush TD · 0.4 tgt · 0.3 rec · 5 rec yds · 0.04 rec TD</w:t>
+            </w:r>
+          </w:p>
+        </w:tc>
+        <w:tc>
+          <w:tcPr>
+            <w:tcW w:type="dxa" w:w="893"/>
+            <w:vAlign w:val="center"/>
+          </w:tcPr>
+          <w:p>
+            <w:pPr>
+              <w:jc w:val="right"/>
+            </w:pPr>
+            <w:r>
+              <w:rPr>
+                <w:sz w:val="18"/>
+              </w:rPr>
+              <w:t>0.76</w:t>
+            </w:r>
+          </w:p>
+        </w:tc>
+        <w:tc>
+          <w:tcPr>
+            <w:tcW w:type="dxa" w:w="893"/>
+            <w:vAlign w:val="center"/>
+          </w:tcPr>
+          <w:p>
+            <w:pPr>
+              <w:jc w:val="right"/>
+            </w:pPr>
+            <w:r>
+              <w:rPr>
+                <w:sz w:val="18"/>
+              </w:rPr>
+              <w:t>0.93</w:t>
+            </w:r>
+          </w:p>
+        </w:tc>
+        <w:tc>
+          <w:tcPr>
+            <w:tcW w:type="dxa" w:w="893"/>
+            <w:vAlign w:val="center"/>
+          </w:tcPr>
+          <w:p>
+            <w:pPr>
+              <w:jc w:val="right"/>
+            </w:pPr>
+            <w:r>
+              <w:rPr>
+                <w:b/>
+                <w:sz w:val="18"/>
+              </w:rPr>
+              <w:t>1.10</w:t>
             </w:r>
           </w:p>
         </w:tc>

</xml_diff>